<commit_message>
Add Bagging step, time-series applicability note, and text-dump helper
- Notebook: new Bagging (bootstrap aggregating) section between the tuned
  Decision Tree and the Random Forest, with and without class-weighted base
  trees, plus a note on why time-series methods do not apply to this data
- Report and slides: bagging rows in the comparison tables and chart, wording
  updated to walk from one tree to bagging to a forest
- scripts/dump_text.py: plain-text dumps of the three deliverables for review

Co-Authored-By: Claude Fable 5.1 <noreply@anthropic.com>
Claude-Session: https://claude.ai/code/session_013FziBHdvbXYQwd5XRG4tZw
</commit_message>
<xml_diff>
--- a/reports/Loan_Default_Prediction_Final_Report.docx
+++ b/reports/Loan_Default_Prediction_Final_Report.docx
@@ -1260,7 +1260,7 @@
           <w:sz w:val="22"/>
           <w:szCs w:val="22"/>
         </w:rPr>
-        <w:t xml:space="preserve">Logistic regression (the transparent linear benchmark), a decision tree (readable rules) and a random forest (an ensemble of trees) were trained on the same 70/30 stratified split, tuned with cross-validated grid search optimising recall, and evaluated on the held-out 30%. The table below summarises the result.</w:t>
+        <w:t xml:space="preserve">Logistic regression (the transparent linear benchmark), a decision tree (readable rules), a bagged ensemble of trees and a random forest were trained on the same 70/30 stratified split, tuned with cross-validated grid search optimising recall, and evaluated on the held-out 30%. Building up from one tree to bagging to a forest makes the contribution of each idea visible. Time-series techniques were not applicable because the applications carry no dates. The table below summarises the result.</w:t>
       </w:r>
     </w:p>
     <w:tbl>
@@ -2159,6 +2159,181 @@
                 <w:szCs w:val="19"/>
               </w:rPr>
               <w:t xml:space="preserve">0.88</w:t>
+            </w:r>
+          </w:p>
+        </w:tc>
+      </w:tr>
+      <w:tr>
+        <w:trPr>
+          <w:cantSplit/>
+        </w:trPr>
+        <w:tc>
+          <w:tcPr>
+            <w:tcW w:type="dxa" w:w="4160"/>
+            <w:tcBorders>
+              <w:top w:val="single" w:color="BFBFBF" w:sz="4"/>
+              <w:left w:val="single" w:color="BFBFBF" w:sz="4"/>
+              <w:bottom w:val="single" w:color="BFBFBF" w:sz="4"/>
+              <w:right w:val="single" w:color="BFBFBF" w:sz="4"/>
+            </w:tcBorders>
+            <w:tcMar>
+              <w:top w:type="dxa" w:w="60"/>
+              <w:left w:type="dxa" w:w="100"/>
+              <w:bottom w:type="dxa" w:w="60"/>
+              <w:right w:type="dxa" w:w="100"/>
+            </w:tcMar>
+          </w:tcPr>
+          <w:p>
+            <w:pPr>
+              <w:spacing w:after="0"/>
+              <w:jc w:val="left"/>
+            </w:pPr>
+            <w:r>
+              <w:rPr>
+                <w:rFonts w:ascii="Calibri" w:cs="Calibri" w:eastAsia="Calibri" w:hAnsi="Calibri"/>
+                <w:b w:val="false"/>
+                <w:bCs w:val="false"/>
+                <w:color w:val="000000"/>
+                <w:sz w:val="19"/>
+                <w:szCs w:val="19"/>
+              </w:rPr>
+              <w:t xml:space="preserve">Bagged trees (200 trees)</w:t>
+            </w:r>
+          </w:p>
+        </w:tc>
+        <w:tc>
+          <w:tcPr>
+            <w:tcW w:type="dxa" w:w="1400"/>
+            <w:tcBorders>
+              <w:top w:val="single" w:color="BFBFBF" w:sz="4"/>
+              <w:left w:val="single" w:color="BFBFBF" w:sz="4"/>
+              <w:bottom w:val="single" w:color="BFBFBF" w:sz="4"/>
+              <w:right w:val="single" w:color="BFBFBF" w:sz="4"/>
+            </w:tcBorders>
+            <w:tcMar>
+              <w:top w:type="dxa" w:w="60"/>
+              <w:left w:type="dxa" w:w="100"/>
+              <w:bottom w:type="dxa" w:w="60"/>
+              <w:right w:type="dxa" w:w="100"/>
+            </w:tcMar>
+          </w:tcPr>
+          <w:p>
+            <w:pPr>
+              <w:spacing w:after="0"/>
+              <w:jc w:val="right"/>
+            </w:pPr>
+            <w:r>
+              <w:rPr>
+                <w:rFonts w:ascii="Calibri" w:cs="Calibri" w:eastAsia="Calibri" w:hAnsi="Calibri"/>
+                <w:b w:val="false"/>
+                <w:bCs w:val="false"/>
+                <w:color w:val="000000"/>
+                <w:sz w:val="19"/>
+                <w:szCs w:val="19"/>
+              </w:rPr>
+              <w:t xml:space="preserve">68%</w:t>
+            </w:r>
+          </w:p>
+        </w:tc>
+        <w:tc>
+          <w:tcPr>
+            <w:tcW w:type="dxa" w:w="1200"/>
+            <w:tcBorders>
+              <w:top w:val="single" w:color="BFBFBF" w:sz="4"/>
+              <w:left w:val="single" w:color="BFBFBF" w:sz="4"/>
+              <w:bottom w:val="single" w:color="BFBFBF" w:sz="4"/>
+              <w:right w:val="single" w:color="BFBFBF" w:sz="4"/>
+            </w:tcBorders>
+            <w:tcMar>
+              <w:top w:type="dxa" w:w="60"/>
+              <w:left w:type="dxa" w:w="100"/>
+              <w:bottom w:type="dxa" w:w="60"/>
+              <w:right w:type="dxa" w:w="100"/>
+            </w:tcMar>
+          </w:tcPr>
+          <w:p>
+            <w:pPr>
+              <w:spacing w:after="0"/>
+              <w:jc w:val="right"/>
+            </w:pPr>
+            <w:r>
+              <w:rPr>
+                <w:rFonts w:ascii="Calibri" w:cs="Calibri" w:eastAsia="Calibri" w:hAnsi="Calibri"/>
+                <w:b w:val="false"/>
+                <w:bCs w:val="false"/>
+                <w:color w:val="000000"/>
+                <w:sz w:val="19"/>
+                <w:szCs w:val="19"/>
+              </w:rPr>
+              <w:t xml:space="preserve">83%</w:t>
+            </w:r>
+          </w:p>
+        </w:tc>
+        <w:tc>
+          <w:tcPr>
+            <w:tcW w:type="dxa" w:w="1200"/>
+            <w:tcBorders>
+              <w:top w:val="single" w:color="BFBFBF" w:sz="4"/>
+              <w:left w:val="single" w:color="BFBFBF" w:sz="4"/>
+              <w:bottom w:val="single" w:color="BFBFBF" w:sz="4"/>
+              <w:right w:val="single" w:color="BFBFBF" w:sz="4"/>
+            </w:tcBorders>
+            <w:tcMar>
+              <w:top w:type="dxa" w:w="60"/>
+              <w:left w:type="dxa" w:w="100"/>
+              <w:bottom w:type="dxa" w:w="60"/>
+              <w:right w:type="dxa" w:w="100"/>
+            </w:tcMar>
+          </w:tcPr>
+          <w:p>
+            <w:pPr>
+              <w:spacing w:after="0"/>
+              <w:jc w:val="right"/>
+            </w:pPr>
+            <w:r>
+              <w:rPr>
+                <w:rFonts w:ascii="Calibri" w:cs="Calibri" w:eastAsia="Calibri" w:hAnsi="Calibri"/>
+                <w:b w:val="false"/>
+                <w:bCs w:val="false"/>
+                <w:color w:val="000000"/>
+                <w:sz w:val="19"/>
+                <w:szCs w:val="19"/>
+              </w:rPr>
+              <w:t xml:space="preserve">91%</w:t>
+            </w:r>
+          </w:p>
+        </w:tc>
+        <w:tc>
+          <w:tcPr>
+            <w:tcW w:type="dxa" w:w="1400"/>
+            <w:tcBorders>
+              <w:top w:val="single" w:color="BFBFBF" w:sz="4"/>
+              <w:left w:val="single" w:color="BFBFBF" w:sz="4"/>
+              <w:bottom w:val="single" w:color="BFBFBF" w:sz="4"/>
+              <w:right w:val="single" w:color="BFBFBF" w:sz="4"/>
+            </w:tcBorders>
+            <w:tcMar>
+              <w:top w:type="dxa" w:w="60"/>
+              <w:left w:type="dxa" w:w="100"/>
+              <w:bottom w:type="dxa" w:w="60"/>
+              <w:right w:type="dxa" w:w="100"/>
+            </w:tcMar>
+          </w:tcPr>
+          <w:p>
+            <w:pPr>
+              <w:spacing w:after="0"/>
+              <w:jc w:val="right"/>
+            </w:pPr>
+            <w:r>
+              <w:rPr>
+                <w:rFonts w:ascii="Calibri" w:cs="Calibri" w:eastAsia="Calibri" w:hAnsi="Calibri"/>
+                <w:b w:val="false"/>
+                <w:bCs w:val="false"/>
+                <w:color w:val="000000"/>
+                <w:sz w:val="19"/>
+                <w:szCs w:val="19"/>
+              </w:rPr>
+              <w:t xml:space="preserve">0.95</w:t>
             </w:r>
           </w:p>
         </w:tc>
@@ -3140,7 +3315,7 @@
           <w:sz w:val="22"/>
           <w:szCs w:val="22"/>
         </w:rPr>
-        <w:t xml:space="preserve">because it offers the best balance on the chosen metric. The tuned decision tree catches slightly more defaulters at the 0.5 threshold (82%) but declines almost one good customer for every defaulter it catches (53% precision). The balanced logistic regression catches 80% but with 61% precision, because a straight line cannot represent the threshold effects in the data. The class-weighted forest catches 78% at 77% precision and ranks applicants by risk most accurately (ROC-AUC 0.96), which is what makes the next step possible.</w:t>
+        <w:t xml:space="preserve">because it offers the best balance on the chosen metric. The tuned decision tree catches slightly more defaulters at the 0.5 threshold (82%) but declines almost one good customer for every defaulter it catches (53% precision). The balanced logistic regression catches 80% but with 61% precision, because a straight line cannot represent the threshold effects in the data. Bagging 200 trees shows the value of averaging: at the same recall as a single fully grown tree, precision rises from 71% to 83% and ROC-AUC from 0.81 to 0.95. The class-weighted forest adds feature sub-sampling and class weights, catches 78% at 77% precision and ranks applicants by risk most accurately (ROC-AUC 0.96), which is what makes the next step possible.</w:t>
       </w:r>
     </w:p>
     <w:p>

</xml_diff>

<commit_message>
Align final report with the Report Template guidance
- Replace notebook chart screenshots with business-labelled charts drawn for
  the report (scripts/make_report_figures.py reads the executed notebook so
  numbers cannot drift); plain-language names instead of variable names
- Add "Key next steps" to the executive summary; define ROC-AUC in plain words
- Replace the confusion-matrix image with a plain decision table
- Keep short tables together across pages

Co-Authored-By: Claude Fable 5.1 <noreply@anthropic.com>
Claude-Session: https://claude.ai/code/session_013FziBHdvbXYQwd5XRG4tZw
</commit_message>
<xml_diff>
--- a/reports/Loan_Default_Prediction_Final_Report.docx
+++ b/reports/Loan_Default_Prediction_Final_Report.docx
@@ -356,7 +356,7 @@
           <w:sz w:val="22"/>
           <w:szCs w:val="22"/>
         </w:rPr>
-        <w:t xml:space="preserve">The relationships in this data are thresholds and cliffs rather than straight lines. A class-weighted Random Forest reached a ROC-AUC of 0.96 against 0.91 for logistic regression, and at a similar share of defaulters caught it declined far fewer good customers.</w:t>
+        <w:t xml:space="preserve">The relationships in this data are thresholds and cliffs rather than straight lines. A class-weighted Random Forest scored 0.96 on risk-ranking quality (ROC-AUC, where 1.0 means every defaulter is ranked above every repayer) against 0.91 for logistic regression, and at a similar share of defaulters caught it declined far fewer good customers.</w:t>
       </w:r>
     </w:p>
     <w:p>
@@ -417,6 +417,7 @@
           </w:tcPr>
           <w:p>
             <w:pPr>
+              <w:keepNext w:val="false"/>
               <w:spacing w:after="0"/>
               <w:jc w:val="left"/>
             </w:pPr>
@@ -452,6 +453,7 @@
           </w:tcPr>
           <w:p>
             <w:pPr>
+              <w:keepNext w:val="false"/>
               <w:spacing w:after="0"/>
               <w:jc w:val="left"/>
             </w:pPr>
@@ -491,6 +493,7 @@
           </w:tcPr>
           <w:p>
             <w:pPr>
+              <w:keepNext w:val="false"/>
               <w:spacing w:after="0"/>
               <w:jc w:val="left"/>
             </w:pPr>
@@ -525,6 +528,7 @@
           </w:tcPr>
           <w:p>
             <w:pPr>
+              <w:keepNext w:val="false"/>
               <w:spacing w:after="0"/>
               <w:jc w:val="left"/>
             </w:pPr>
@@ -564,6 +568,7 @@
           </w:tcPr>
           <w:p>
             <w:pPr>
+              <w:keepNext w:val="false"/>
               <w:spacing w:after="0"/>
               <w:jc w:val="left"/>
             </w:pPr>
@@ -598,6 +603,7 @@
           </w:tcPr>
           <w:p>
             <w:pPr>
+              <w:keepNext w:val="false"/>
               <w:spacing w:after="0"/>
               <w:jc w:val="left"/>
             </w:pPr>
@@ -637,6 +643,7 @@
           </w:tcPr>
           <w:p>
             <w:pPr>
+              <w:keepNext w:val="false"/>
               <w:spacing w:after="0"/>
               <w:jc w:val="left"/>
             </w:pPr>
@@ -671,6 +678,7 @@
           </w:tcPr>
           <w:p>
             <w:pPr>
+              <w:keepNext w:val="false"/>
               <w:spacing w:after="0"/>
               <w:jc w:val="left"/>
             </w:pPr>
@@ -710,6 +718,7 @@
           </w:tcPr>
           <w:p>
             <w:pPr>
+              <w:keepNext w:val="false"/>
               <w:spacing w:after="0"/>
               <w:jc w:val="left"/>
             </w:pPr>
@@ -744,6 +753,7 @@
           </w:tcPr>
           <w:p>
             <w:pPr>
+              <w:keepNext w:val="false"/>
               <w:spacing w:after="0"/>
               <w:jc w:val="left"/>
             </w:pPr>
@@ -783,6 +793,7 @@
           </w:tcPr>
           <w:p>
             <w:pPr>
+              <w:keepNext w:val="false"/>
               <w:spacing w:after="0"/>
               <w:jc w:val="left"/>
             </w:pPr>
@@ -817,6 +828,7 @@
           </w:tcPr>
           <w:p>
             <w:pPr>
+              <w:keepNext w:val="false"/>
               <w:spacing w:after="0"/>
               <w:jc w:val="left"/>
             </w:pPr>
@@ -856,6 +868,7 @@
           </w:tcPr>
           <w:p>
             <w:pPr>
+              <w:keepNext w:val="false"/>
               <w:spacing w:after="0"/>
               <w:jc w:val="left"/>
             </w:pPr>
@@ -890,6 +903,7 @@
           </w:tcPr>
           <w:p>
             <w:pPr>
+              <w:keepNext w:val="false"/>
               <w:spacing w:after="0"/>
               <w:jc w:val="left"/>
             </w:pPr>
@@ -929,6 +943,7 @@
           </w:tcPr>
           <w:p>
             <w:pPr>
+              <w:keepNext w:val="false"/>
               <w:spacing w:after="0"/>
               <w:jc w:val="left"/>
             </w:pPr>
@@ -963,19 +978,20 @@
           </w:tcPr>
           <w:p>
             <w:pPr>
-              <w:spacing w:after="0"/>
-              <w:jc w:val="left"/>
-            </w:pPr>
-            <w:r>
-              <w:rPr>
-                <w:rFonts w:ascii="Calibri" w:cs="Calibri" w:eastAsia="Calibri" w:hAnsi="Calibri"/>
-                <w:b w:val="false"/>
-                <w:bCs w:val="false"/>
-                <w:color w:val="000000"/>
-                <w:sz w:val="19"/>
-                <w:szCs w:val="19"/>
-              </w:rPr>
-              <w:t xml:space="preserve">93% of defaulters caught (recall), 67% precision, 90% accuracy, ROC-AUC 0.96. At the default 0.5 threshold: 78% recall, 77% precision, 91% accuracy.</w:t>
+              <w:keepNext w:val="false"/>
+              <w:spacing w:after="0"/>
+              <w:jc w:val="left"/>
+            </w:pPr>
+            <w:r>
+              <w:rPr>
+                <w:rFonts w:ascii="Calibri" w:cs="Calibri" w:eastAsia="Calibri" w:hAnsi="Calibri"/>
+                <w:b w:val="false"/>
+                <w:bCs w:val="false"/>
+                <w:color w:val="000000"/>
+                <w:sz w:val="19"/>
+                <w:szCs w:val="19"/>
+              </w:rPr>
+              <w:t xml:space="preserve">93.3% of defaulters caught (recall), 67.0% precision, 89.5% accuracy, risk-ranking quality (ROC-AUC) 0.96. At the default 0.5 threshold: 78.4% recall, 77.3% precision, 91.1% accuracy.</w:t>
             </w:r>
           </w:p>
         </w:tc>
@@ -1002,6 +1018,7 @@
           </w:tcPr>
           <w:p>
             <w:pPr>
+              <w:keepNext w:val="false"/>
               <w:spacing w:after="0"/>
               <w:jc w:val="left"/>
             </w:pPr>
@@ -1036,6 +1053,7 @@
           </w:tcPr>
           <w:p>
             <w:pPr>
+              <w:keepNext w:val="false"/>
               <w:spacing w:after="0"/>
               <w:jc w:val="left"/>
             </w:pPr>
@@ -1058,6 +1076,164 @@
       <w:pPr>
         <w:spacing w:after="120"/>
       </w:pPr>
+    </w:p>
+    <w:p>
+      <w:pPr>
+        <w:pStyle w:val="Heading2"/>
+        <w:keepNext/>
+        <w:spacing w:after="120" w:before="240"/>
+      </w:pPr>
+      <w:r>
+        <w:rPr>
+          <w:rFonts w:ascii="Calibri" w:cs="Calibri" w:eastAsia="Calibri" w:hAnsi="Calibri"/>
+          <w:b/>
+          <w:bCs/>
+          <w:color w:val="1E2761"/>
+          <w:sz w:val="25"/>
+          <w:szCs w:val="25"/>
+        </w:rPr>
+        <w:t xml:space="preserve">Key next steps</w:t>
+      </w:r>
+    </w:p>
+    <w:p>
+      <w:pPr>
+        <w:pStyle w:val="ListParagraph"/>
+        <w:numPr>
+          <w:ilvl w:val="0"/>
+          <w:numId w:val="2"/>
+        </w:numPr>
+        <w:spacing w:after="90" w:line="264"/>
+      </w:pPr>
+      <w:r>
+        <w:rPr>
+          <w:rFonts w:ascii="Calibri" w:cs="Calibri" w:eastAsia="Calibri" w:hAnsi="Calibri"/>
+          <w:b/>
+          <w:bCs/>
+          <w:sz w:val="22"/>
+          <w:szCs w:val="22"/>
+        </w:rPr>
+        <w:t xml:space="preserve">Decide and calibrate: </w:t>
+      </w:r>
+      <w:r>
+        <w:rPr>
+          <w:rFonts w:ascii="Calibri" w:cs="Calibri" w:eastAsia="Calibri" w:hAnsi="Calibri"/>
+          <w:sz w:val="22"/>
+          <w:szCs w:val="22"/>
+        </w:rPr>
+        <w:t xml:space="preserve">the head of consumer credit approves the three-band policy (approve / refer / decline); finance supplies actual loss-given-default and margin figures so the 0.25 threshold can be confirmed.</w:t>
+      </w:r>
+    </w:p>
+    <w:p>
+      <w:pPr>
+        <w:pStyle w:val="ListParagraph"/>
+        <w:numPr>
+          <w:ilvl w:val="0"/>
+          <w:numId w:val="2"/>
+        </w:numPr>
+        <w:spacing w:after="90" w:line="264"/>
+      </w:pPr>
+      <w:r>
+        <w:rPr>
+          <w:rFonts w:ascii="Calibri" w:cs="Calibri" w:eastAsia="Calibri" w:hAnsi="Calibri"/>
+          <w:b/>
+          <w:bCs/>
+          <w:sz w:val="22"/>
+          <w:szCs w:val="22"/>
+        </w:rPr>
+        <w:t xml:space="preserve">Prepare the process: </w:t>
+      </w:r>
+      <w:r>
+        <w:rPr>
+          <w:rFonts w:ascii="Calibri" w:cs="Calibri" w:eastAsia="Calibri" w:hAnsi="Calibri"/>
+          <w:sz w:val="22"/>
+          <w:szCs w:val="22"/>
+        </w:rPr>
+        <w:t xml:space="preserve">make income and property-valuation verification mandatory fields, since their absence is the strongest default signal; build the scoring pipeline with reason codes.</w:t>
+      </w:r>
+    </w:p>
+    <w:p>
+      <w:pPr>
+        <w:pStyle w:val="ListParagraph"/>
+        <w:numPr>
+          <w:ilvl w:val="0"/>
+          <w:numId w:val="2"/>
+        </w:numPr>
+        <w:spacing w:after="90" w:line="264"/>
+      </w:pPr>
+      <w:r>
+        <w:rPr>
+          <w:rFonts w:ascii="Calibri" w:cs="Calibri" w:eastAsia="Calibri" w:hAnsi="Calibri"/>
+          <w:b/>
+          <w:bCs/>
+          <w:sz w:val="22"/>
+          <w:szCs w:val="22"/>
+        </w:rPr>
+        <w:t xml:space="preserve">Prove it safely: </w:t>
+      </w:r>
+      <w:r>
+        <w:rPr>
+          <w:rFonts w:ascii="Calibri" w:cs="Calibri" w:eastAsia="Calibri" w:hAnsi="Calibri"/>
+          <w:sz w:val="22"/>
+          <w:szCs w:val="22"/>
+        </w:rPr>
+        <w:t xml:space="preserve">run the model in shadow mode alongside manual decisions for one to two months and complete a fair-lending review before switching it on.</w:t>
+      </w:r>
+    </w:p>
+    <w:p>
+      <w:pPr>
+        <w:pStyle w:val="ListParagraph"/>
+        <w:numPr>
+          <w:ilvl w:val="0"/>
+          <w:numId w:val="2"/>
+        </w:numPr>
+        <w:spacing w:after="90" w:line="264"/>
+      </w:pPr>
+      <w:r>
+        <w:rPr>
+          <w:rFonts w:ascii="Calibri" w:cs="Calibri" w:eastAsia="Calibri" w:hAnsi="Calibri"/>
+          <w:b/>
+          <w:bCs/>
+          <w:sz w:val="22"/>
+          <w:szCs w:val="22"/>
+        </w:rPr>
+        <w:t xml:space="preserve">Make the most of it: </w:t>
+      </w:r>
+      <w:r>
+        <w:rPr>
+          <w:rFonts w:ascii="Calibri" w:cs="Calibri" w:eastAsia="Calibri" w:hAnsi="Calibri"/>
+          <w:sz w:val="22"/>
+          <w:szCs w:val="22"/>
+        </w:rPr>
+        <w:t xml:space="preserve">automate clear approvals and declines, route the uncertain band to underwriters, monitor recall, precision and approval rate monthly, and re-train yearly.</w:t>
+      </w:r>
+    </w:p>
+    <w:p>
+      <w:pPr>
+        <w:pStyle w:val="ListParagraph"/>
+        <w:numPr>
+          <w:ilvl w:val="0"/>
+          <w:numId w:val="2"/>
+        </w:numPr>
+        <w:spacing w:after="90" w:line="264"/>
+      </w:pPr>
+      <w:r>
+        <w:rPr>
+          <w:rFonts w:ascii="Calibri" w:cs="Calibri" w:eastAsia="Calibri" w:hAnsi="Calibri"/>
+          <w:b/>
+          <w:bCs/>
+          <w:sz w:val="22"/>
+          <w:szCs w:val="22"/>
+        </w:rPr>
+        <w:t xml:space="preserve">Improve it: </w:t>
+      </w:r>
+      <w:r>
+        <w:rPr>
+          <w:rFonts w:ascii="Calibri" w:cs="Calibri" w:eastAsia="Calibri" w:hAnsi="Calibri"/>
+          <w:sz w:val="22"/>
+          <w:szCs w:val="22"/>
+        </w:rPr>
+        <w:t xml:space="preserve">add reject inference, loan-to-value and payment-to-income features, probability calibration and time-based validation in the next iteration.</w:t>
+      </w:r>
     </w:p>
     <w:p>
       <w:pPr>
@@ -1276,11 +1452,11 @@
         </w:tblBorders>
       </w:tblPr>
       <w:tblGrid>
-        <w:gridCol w:w="4160"/>
+        <w:gridCol w:w="3860"/>
         <w:gridCol w:w="1400"/>
         <w:gridCol w:w="1200"/>
         <w:gridCol w:w="1200"/>
-        <w:gridCol w:w="1400"/>
+        <w:gridCol w:w="1700"/>
       </w:tblGrid>
       <w:tr>
         <w:trPr>
@@ -1289,7 +1465,7 @@
         </w:trPr>
         <w:tc>
           <w:tcPr>
-            <w:tcW w:type="dxa" w:w="4160"/>
+            <w:tcW w:type="dxa" w:w="3860"/>
             <w:tcBorders>
               <w:top w:val="single" w:color="BFBFBF" w:sz="4"/>
               <w:left w:val="single" w:color="BFBFBF" w:sz="4"/>
@@ -1306,6 +1482,7 @@
           </w:tcPr>
           <w:p>
             <w:pPr>
+              <w:keepNext w:val="false"/>
               <w:spacing w:after="0"/>
               <w:jc w:val="left"/>
             </w:pPr>
@@ -1318,7 +1495,7 @@
                 <w:sz w:val="19"/>
                 <w:szCs w:val="19"/>
               </w:rPr>
-              <w:t xml:space="preserve">Model (test set, 1,788 applicants)</w:t>
+              <w:t xml:space="preserve">Model (held-out test set, 1,788 applicants)</w:t>
             </w:r>
           </w:p>
         </w:tc>
@@ -1341,6 +1518,7 @@
           </w:tcPr>
           <w:p>
             <w:pPr>
+              <w:keepNext w:val="false"/>
               <w:spacing w:after="0"/>
               <w:jc w:val="left"/>
             </w:pPr>
@@ -1376,6 +1554,7 @@
           </w:tcPr>
           <w:p>
             <w:pPr>
+              <w:keepNext w:val="false"/>
               <w:spacing w:after="0"/>
               <w:jc w:val="left"/>
             </w:pPr>
@@ -1411,6 +1590,7 @@
           </w:tcPr>
           <w:p>
             <w:pPr>
+              <w:keepNext w:val="false"/>
               <w:spacing w:after="0"/>
               <w:jc w:val="left"/>
             </w:pPr>
@@ -1429,7 +1609,7 @@
         </w:tc>
         <w:tc>
           <w:tcPr>
-            <w:tcW w:type="dxa" w:w="1400"/>
+            <w:tcW w:type="dxa" w:w="1700"/>
             <w:tcBorders>
               <w:top w:val="single" w:color="BFBFBF" w:sz="4"/>
               <w:left w:val="single" w:color="BFBFBF" w:sz="4"/>
@@ -1446,6 +1626,7 @@
           </w:tcPr>
           <w:p>
             <w:pPr>
+              <w:keepNext w:val="false"/>
               <w:spacing w:after="0"/>
               <w:jc w:val="left"/>
             </w:pPr>
@@ -1458,7 +1639,7 @@
                 <w:sz w:val="19"/>
                 <w:szCs w:val="19"/>
               </w:rPr>
-              <w:t xml:space="preserve">ROC-AUC</w:t>
+              <w:t xml:space="preserve">Risk-ranking quality (ROC-AUC)</w:t>
             </w:r>
           </w:p>
         </w:tc>
@@ -1469,22 +1650,23 @@
         </w:trPr>
         <w:tc>
           <w:tcPr>
-            <w:tcW w:type="dxa" w:w="4160"/>
-            <w:tcBorders>
-              <w:top w:val="single" w:color="BFBFBF" w:sz="4"/>
-              <w:left w:val="single" w:color="BFBFBF" w:sz="4"/>
-              <w:bottom w:val="single" w:color="BFBFBF" w:sz="4"/>
-              <w:right w:val="single" w:color="BFBFBF" w:sz="4"/>
-            </w:tcBorders>
-            <w:tcMar>
-              <w:top w:type="dxa" w:w="60"/>
-              <w:left w:type="dxa" w:w="100"/>
-              <w:bottom w:type="dxa" w:w="60"/>
-              <w:right w:type="dxa" w:w="100"/>
-            </w:tcMar>
-          </w:tcPr>
-          <w:p>
-            <w:pPr>
+            <w:tcW w:type="dxa" w:w="3860"/>
+            <w:tcBorders>
+              <w:top w:val="single" w:color="BFBFBF" w:sz="4"/>
+              <w:left w:val="single" w:color="BFBFBF" w:sz="4"/>
+              <w:bottom w:val="single" w:color="BFBFBF" w:sz="4"/>
+              <w:right w:val="single" w:color="BFBFBF" w:sz="4"/>
+            </w:tcBorders>
+            <w:tcMar>
+              <w:top w:type="dxa" w:w="60"/>
+              <w:left w:type="dxa" w:w="100"/>
+              <w:bottom w:type="dxa" w:w="60"/>
+              <w:right w:type="dxa" w:w="100"/>
+            </w:tcMar>
+          </w:tcPr>
+          <w:p>
+            <w:pPr>
+              <w:keepNext w:val="false"/>
               <w:spacing w:after="0"/>
               <w:jc w:val="left"/>
             </w:pPr>
@@ -1519,6 +1701,7 @@
           </w:tcPr>
           <w:p>
             <w:pPr>
+              <w:keepNext w:val="false"/>
               <w:spacing w:after="0"/>
               <w:jc w:val="right"/>
             </w:pPr>
@@ -1553,6 +1736,7 @@
           </w:tcPr>
           <w:p>
             <w:pPr>
+              <w:keepNext w:val="false"/>
               <w:spacing w:after="0"/>
               <w:jc w:val="right"/>
             </w:pPr>
@@ -1587,6 +1771,7 @@
           </w:tcPr>
           <w:p>
             <w:pPr>
+              <w:keepNext w:val="false"/>
               <w:spacing w:after="0"/>
               <w:jc w:val="right"/>
             </w:pPr>
@@ -1605,22 +1790,23 @@
         </w:tc>
         <w:tc>
           <w:tcPr>
-            <w:tcW w:type="dxa" w:w="1400"/>
-            <w:tcBorders>
-              <w:top w:val="single" w:color="BFBFBF" w:sz="4"/>
-              <w:left w:val="single" w:color="BFBFBF" w:sz="4"/>
-              <w:bottom w:val="single" w:color="BFBFBF" w:sz="4"/>
-              <w:right w:val="single" w:color="BFBFBF" w:sz="4"/>
-            </w:tcBorders>
-            <w:tcMar>
-              <w:top w:type="dxa" w:w="60"/>
-              <w:left w:type="dxa" w:w="100"/>
-              <w:bottom w:type="dxa" w:w="60"/>
-              <w:right w:type="dxa" w:w="100"/>
-            </w:tcMar>
-          </w:tcPr>
-          <w:p>
-            <w:pPr>
+            <w:tcW w:type="dxa" w:w="1700"/>
+            <w:tcBorders>
+              <w:top w:val="single" w:color="BFBFBF" w:sz="4"/>
+              <w:left w:val="single" w:color="BFBFBF" w:sz="4"/>
+              <w:bottom w:val="single" w:color="BFBFBF" w:sz="4"/>
+              <w:right w:val="single" w:color="BFBFBF" w:sz="4"/>
+            </w:tcBorders>
+            <w:tcMar>
+              <w:top w:type="dxa" w:w="60"/>
+              <w:left w:type="dxa" w:w="100"/>
+              <w:bottom w:type="dxa" w:w="60"/>
+              <w:right w:type="dxa" w:w="100"/>
+            </w:tcMar>
+          </w:tcPr>
+          <w:p>
+            <w:pPr>
+              <w:keepNext w:val="false"/>
               <w:spacing w:after="0"/>
               <w:jc w:val="right"/>
             </w:pPr>
@@ -1644,22 +1830,23 @@
         </w:trPr>
         <w:tc>
           <w:tcPr>
-            <w:tcW w:type="dxa" w:w="4160"/>
-            <w:tcBorders>
-              <w:top w:val="single" w:color="BFBFBF" w:sz="4"/>
-              <w:left w:val="single" w:color="BFBFBF" w:sz="4"/>
-              <w:bottom w:val="single" w:color="BFBFBF" w:sz="4"/>
-              <w:right w:val="single" w:color="BFBFBF" w:sz="4"/>
-            </w:tcBorders>
-            <w:tcMar>
-              <w:top w:type="dxa" w:w="60"/>
-              <w:left w:type="dxa" w:w="100"/>
-              <w:bottom w:type="dxa" w:w="60"/>
-              <w:right w:type="dxa" w:w="100"/>
-            </w:tcMar>
-          </w:tcPr>
-          <w:p>
-            <w:pPr>
+            <w:tcW w:type="dxa" w:w="3860"/>
+            <w:tcBorders>
+              <w:top w:val="single" w:color="BFBFBF" w:sz="4"/>
+              <w:left w:val="single" w:color="BFBFBF" w:sz="4"/>
+              <w:bottom w:val="single" w:color="BFBFBF" w:sz="4"/>
+              <w:right w:val="single" w:color="BFBFBF" w:sz="4"/>
+            </w:tcBorders>
+            <w:tcMar>
+              <w:top w:type="dxa" w:w="60"/>
+              <w:left w:type="dxa" w:w="100"/>
+              <w:bottom w:type="dxa" w:w="60"/>
+              <w:right w:type="dxa" w:w="100"/>
+            </w:tcMar>
+          </w:tcPr>
+          <w:p>
+            <w:pPr>
+              <w:keepNext w:val="false"/>
               <w:spacing w:after="0"/>
               <w:jc w:val="left"/>
             </w:pPr>
@@ -1694,6 +1881,7 @@
           </w:tcPr>
           <w:p>
             <w:pPr>
+              <w:keepNext w:val="false"/>
               <w:spacing w:after="0"/>
               <w:jc w:val="right"/>
             </w:pPr>
@@ -1728,6 +1916,7 @@
           </w:tcPr>
           <w:p>
             <w:pPr>
+              <w:keepNext w:val="false"/>
               <w:spacing w:after="0"/>
               <w:jc w:val="right"/>
             </w:pPr>
@@ -1762,6 +1951,7 @@
           </w:tcPr>
           <w:p>
             <w:pPr>
+              <w:keepNext w:val="false"/>
               <w:spacing w:after="0"/>
               <w:jc w:val="right"/>
             </w:pPr>
@@ -1780,22 +1970,23 @@
         </w:tc>
         <w:tc>
           <w:tcPr>
-            <w:tcW w:type="dxa" w:w="1400"/>
-            <w:tcBorders>
-              <w:top w:val="single" w:color="BFBFBF" w:sz="4"/>
-              <w:left w:val="single" w:color="BFBFBF" w:sz="4"/>
-              <w:bottom w:val="single" w:color="BFBFBF" w:sz="4"/>
-              <w:right w:val="single" w:color="BFBFBF" w:sz="4"/>
-            </w:tcBorders>
-            <w:tcMar>
-              <w:top w:type="dxa" w:w="60"/>
-              <w:left w:type="dxa" w:w="100"/>
-              <w:bottom w:type="dxa" w:w="60"/>
-              <w:right w:type="dxa" w:w="100"/>
-            </w:tcMar>
-          </w:tcPr>
-          <w:p>
-            <w:pPr>
+            <w:tcW w:type="dxa" w:w="1700"/>
+            <w:tcBorders>
+              <w:top w:val="single" w:color="BFBFBF" w:sz="4"/>
+              <w:left w:val="single" w:color="BFBFBF" w:sz="4"/>
+              <w:bottom w:val="single" w:color="BFBFBF" w:sz="4"/>
+              <w:right w:val="single" w:color="BFBFBF" w:sz="4"/>
+            </w:tcBorders>
+            <w:tcMar>
+              <w:top w:type="dxa" w:w="60"/>
+              <w:left w:type="dxa" w:w="100"/>
+              <w:bottom w:type="dxa" w:w="60"/>
+              <w:right w:type="dxa" w:w="100"/>
+            </w:tcMar>
+          </w:tcPr>
+          <w:p>
+            <w:pPr>
+              <w:keepNext w:val="false"/>
               <w:spacing w:after="0"/>
               <w:jc w:val="right"/>
             </w:pPr>
@@ -1819,22 +2010,23 @@
         </w:trPr>
         <w:tc>
           <w:tcPr>
-            <w:tcW w:type="dxa" w:w="4160"/>
-            <w:tcBorders>
-              <w:top w:val="single" w:color="BFBFBF" w:sz="4"/>
-              <w:left w:val="single" w:color="BFBFBF" w:sz="4"/>
-              <w:bottom w:val="single" w:color="BFBFBF" w:sz="4"/>
-              <w:right w:val="single" w:color="BFBFBF" w:sz="4"/>
-            </w:tcBorders>
-            <w:tcMar>
-              <w:top w:type="dxa" w:w="60"/>
-              <w:left w:type="dxa" w:w="100"/>
-              <w:bottom w:type="dxa" w:w="60"/>
-              <w:right w:type="dxa" w:w="100"/>
-            </w:tcMar>
-          </w:tcPr>
-          <w:p>
-            <w:pPr>
+            <w:tcW w:type="dxa" w:w="3860"/>
+            <w:tcBorders>
+              <w:top w:val="single" w:color="BFBFBF" w:sz="4"/>
+              <w:left w:val="single" w:color="BFBFBF" w:sz="4"/>
+              <w:bottom w:val="single" w:color="BFBFBF" w:sz="4"/>
+              <w:right w:val="single" w:color="BFBFBF" w:sz="4"/>
+            </w:tcBorders>
+            <w:tcMar>
+              <w:top w:type="dxa" w:w="60"/>
+              <w:left w:type="dxa" w:w="100"/>
+              <w:bottom w:type="dxa" w:w="60"/>
+              <w:right w:type="dxa" w:w="100"/>
+            </w:tcMar>
+          </w:tcPr>
+          <w:p>
+            <w:pPr>
+              <w:keepNext w:val="false"/>
               <w:spacing w:after="0"/>
               <w:jc w:val="left"/>
             </w:pPr>
@@ -1869,6 +2061,7 @@
           </w:tcPr>
           <w:p>
             <w:pPr>
+              <w:keepNext w:val="false"/>
               <w:spacing w:after="0"/>
               <w:jc w:val="right"/>
             </w:pPr>
@@ -1903,6 +2096,7 @@
           </w:tcPr>
           <w:p>
             <w:pPr>
+              <w:keepNext w:val="false"/>
               <w:spacing w:after="0"/>
               <w:jc w:val="right"/>
             </w:pPr>
@@ -1937,6 +2131,7 @@
           </w:tcPr>
           <w:p>
             <w:pPr>
+              <w:keepNext w:val="false"/>
               <w:spacing w:after="0"/>
               <w:jc w:val="right"/>
             </w:pPr>
@@ -1955,22 +2150,23 @@
         </w:tc>
         <w:tc>
           <w:tcPr>
-            <w:tcW w:type="dxa" w:w="1400"/>
-            <w:tcBorders>
-              <w:top w:val="single" w:color="BFBFBF" w:sz="4"/>
-              <w:left w:val="single" w:color="BFBFBF" w:sz="4"/>
-              <w:bottom w:val="single" w:color="BFBFBF" w:sz="4"/>
-              <w:right w:val="single" w:color="BFBFBF" w:sz="4"/>
-            </w:tcBorders>
-            <w:tcMar>
-              <w:top w:type="dxa" w:w="60"/>
-              <w:left w:type="dxa" w:w="100"/>
-              <w:bottom w:type="dxa" w:w="60"/>
-              <w:right w:type="dxa" w:w="100"/>
-            </w:tcMar>
-          </w:tcPr>
-          <w:p>
-            <w:pPr>
+            <w:tcW w:type="dxa" w:w="1700"/>
+            <w:tcBorders>
+              <w:top w:val="single" w:color="BFBFBF" w:sz="4"/>
+              <w:left w:val="single" w:color="BFBFBF" w:sz="4"/>
+              <w:bottom w:val="single" w:color="BFBFBF" w:sz="4"/>
+              <w:right w:val="single" w:color="BFBFBF" w:sz="4"/>
+            </w:tcBorders>
+            <w:tcMar>
+              <w:top w:type="dxa" w:w="60"/>
+              <w:left w:type="dxa" w:w="100"/>
+              <w:bottom w:type="dxa" w:w="60"/>
+              <w:right w:type="dxa" w:w="100"/>
+            </w:tcMar>
+          </w:tcPr>
+          <w:p>
+            <w:pPr>
+              <w:keepNext w:val="false"/>
               <w:spacing w:after="0"/>
               <w:jc w:val="right"/>
             </w:pPr>
@@ -1994,22 +2190,23 @@
         </w:trPr>
         <w:tc>
           <w:tcPr>
-            <w:tcW w:type="dxa" w:w="4160"/>
-            <w:tcBorders>
-              <w:top w:val="single" w:color="BFBFBF" w:sz="4"/>
-              <w:left w:val="single" w:color="BFBFBF" w:sz="4"/>
-              <w:bottom w:val="single" w:color="BFBFBF" w:sz="4"/>
-              <w:right w:val="single" w:color="BFBFBF" w:sz="4"/>
-            </w:tcBorders>
-            <w:tcMar>
-              <w:top w:type="dxa" w:w="60"/>
-              <w:left w:type="dxa" w:w="100"/>
-              <w:bottom w:type="dxa" w:w="60"/>
-              <w:right w:type="dxa" w:w="100"/>
-            </w:tcMar>
-          </w:tcPr>
-          <w:p>
-            <w:pPr>
+            <w:tcW w:type="dxa" w:w="3860"/>
+            <w:tcBorders>
+              <w:top w:val="single" w:color="BFBFBF" w:sz="4"/>
+              <w:left w:val="single" w:color="BFBFBF" w:sz="4"/>
+              <w:bottom w:val="single" w:color="BFBFBF" w:sz="4"/>
+              <w:right w:val="single" w:color="BFBFBF" w:sz="4"/>
+            </w:tcBorders>
+            <w:tcMar>
+              <w:top w:type="dxa" w:w="60"/>
+              <w:left w:type="dxa" w:w="100"/>
+              <w:bottom w:type="dxa" w:w="60"/>
+              <w:right w:type="dxa" w:w="100"/>
+            </w:tcMar>
+          </w:tcPr>
+          <w:p>
+            <w:pPr>
+              <w:keepNext w:val="false"/>
               <w:spacing w:after="0"/>
               <w:jc w:val="left"/>
             </w:pPr>
@@ -2044,6 +2241,7 @@
           </w:tcPr>
           <w:p>
             <w:pPr>
+              <w:keepNext w:val="false"/>
               <w:spacing w:after="0"/>
               <w:jc w:val="right"/>
             </w:pPr>
@@ -2078,6 +2276,7 @@
           </w:tcPr>
           <w:p>
             <w:pPr>
+              <w:keepNext w:val="false"/>
               <w:spacing w:after="0"/>
               <w:jc w:val="right"/>
             </w:pPr>
@@ -2112,6 +2311,7 @@
           </w:tcPr>
           <w:p>
             <w:pPr>
+              <w:keepNext w:val="false"/>
               <w:spacing w:after="0"/>
               <w:jc w:val="right"/>
             </w:pPr>
@@ -2130,22 +2330,23 @@
         </w:tc>
         <w:tc>
           <w:tcPr>
-            <w:tcW w:type="dxa" w:w="1400"/>
-            <w:tcBorders>
-              <w:top w:val="single" w:color="BFBFBF" w:sz="4"/>
-              <w:left w:val="single" w:color="BFBFBF" w:sz="4"/>
-              <w:bottom w:val="single" w:color="BFBFBF" w:sz="4"/>
-              <w:right w:val="single" w:color="BFBFBF" w:sz="4"/>
-            </w:tcBorders>
-            <w:tcMar>
-              <w:top w:type="dxa" w:w="60"/>
-              <w:left w:type="dxa" w:w="100"/>
-              <w:bottom w:type="dxa" w:w="60"/>
-              <w:right w:type="dxa" w:w="100"/>
-            </w:tcMar>
-          </w:tcPr>
-          <w:p>
-            <w:pPr>
+            <w:tcW w:type="dxa" w:w="1700"/>
+            <w:tcBorders>
+              <w:top w:val="single" w:color="BFBFBF" w:sz="4"/>
+              <w:left w:val="single" w:color="BFBFBF" w:sz="4"/>
+              <w:bottom w:val="single" w:color="BFBFBF" w:sz="4"/>
+              <w:right w:val="single" w:color="BFBFBF" w:sz="4"/>
+            </w:tcBorders>
+            <w:tcMar>
+              <w:top w:type="dxa" w:w="60"/>
+              <w:left w:type="dxa" w:w="100"/>
+              <w:bottom w:type="dxa" w:w="60"/>
+              <w:right w:type="dxa" w:w="100"/>
+            </w:tcMar>
+          </w:tcPr>
+          <w:p>
+            <w:pPr>
+              <w:keepNext w:val="false"/>
               <w:spacing w:after="0"/>
               <w:jc w:val="right"/>
             </w:pPr>
@@ -2169,22 +2370,23 @@
         </w:trPr>
         <w:tc>
           <w:tcPr>
-            <w:tcW w:type="dxa" w:w="4160"/>
-            <w:tcBorders>
-              <w:top w:val="single" w:color="BFBFBF" w:sz="4"/>
-              <w:left w:val="single" w:color="BFBFBF" w:sz="4"/>
-              <w:bottom w:val="single" w:color="BFBFBF" w:sz="4"/>
-              <w:right w:val="single" w:color="BFBFBF" w:sz="4"/>
-            </w:tcBorders>
-            <w:tcMar>
-              <w:top w:type="dxa" w:w="60"/>
-              <w:left w:type="dxa" w:w="100"/>
-              <w:bottom w:type="dxa" w:w="60"/>
-              <w:right w:type="dxa" w:w="100"/>
-            </w:tcMar>
-          </w:tcPr>
-          <w:p>
-            <w:pPr>
+            <w:tcW w:type="dxa" w:w="3860"/>
+            <w:tcBorders>
+              <w:top w:val="single" w:color="BFBFBF" w:sz="4"/>
+              <w:left w:val="single" w:color="BFBFBF" w:sz="4"/>
+              <w:bottom w:val="single" w:color="BFBFBF" w:sz="4"/>
+              <w:right w:val="single" w:color="BFBFBF" w:sz="4"/>
+            </w:tcBorders>
+            <w:tcMar>
+              <w:top w:type="dxa" w:w="60"/>
+              <w:left w:type="dxa" w:w="100"/>
+              <w:bottom w:type="dxa" w:w="60"/>
+              <w:right w:type="dxa" w:w="100"/>
+            </w:tcMar>
+          </w:tcPr>
+          <w:p>
+            <w:pPr>
+              <w:keepNext w:val="false"/>
               <w:spacing w:after="0"/>
               <w:jc w:val="left"/>
             </w:pPr>
@@ -2219,6 +2421,7 @@
           </w:tcPr>
           <w:p>
             <w:pPr>
+              <w:keepNext w:val="false"/>
               <w:spacing w:after="0"/>
               <w:jc w:val="right"/>
             </w:pPr>
@@ -2253,6 +2456,7 @@
           </w:tcPr>
           <w:p>
             <w:pPr>
+              <w:keepNext w:val="false"/>
               <w:spacing w:after="0"/>
               <w:jc w:val="right"/>
             </w:pPr>
@@ -2287,6 +2491,7 @@
           </w:tcPr>
           <w:p>
             <w:pPr>
+              <w:keepNext w:val="false"/>
               <w:spacing w:after="0"/>
               <w:jc w:val="right"/>
             </w:pPr>
@@ -2305,22 +2510,23 @@
         </w:tc>
         <w:tc>
           <w:tcPr>
-            <w:tcW w:type="dxa" w:w="1400"/>
-            <w:tcBorders>
-              <w:top w:val="single" w:color="BFBFBF" w:sz="4"/>
-              <w:left w:val="single" w:color="BFBFBF" w:sz="4"/>
-              <w:bottom w:val="single" w:color="BFBFBF" w:sz="4"/>
-              <w:right w:val="single" w:color="BFBFBF" w:sz="4"/>
-            </w:tcBorders>
-            <w:tcMar>
-              <w:top w:type="dxa" w:w="60"/>
-              <w:left w:type="dxa" w:w="100"/>
-              <w:bottom w:type="dxa" w:w="60"/>
-              <w:right w:type="dxa" w:w="100"/>
-            </w:tcMar>
-          </w:tcPr>
-          <w:p>
-            <w:pPr>
+            <w:tcW w:type="dxa" w:w="1700"/>
+            <w:tcBorders>
+              <w:top w:val="single" w:color="BFBFBF" w:sz="4"/>
+              <w:left w:val="single" w:color="BFBFBF" w:sz="4"/>
+              <w:bottom w:val="single" w:color="BFBFBF" w:sz="4"/>
+              <w:right w:val="single" w:color="BFBFBF" w:sz="4"/>
+            </w:tcBorders>
+            <w:tcMar>
+              <w:top w:type="dxa" w:w="60"/>
+              <w:left w:type="dxa" w:w="100"/>
+              <w:bottom w:type="dxa" w:w="60"/>
+              <w:right w:type="dxa" w:w="100"/>
+            </w:tcMar>
+          </w:tcPr>
+          <w:p>
+            <w:pPr>
+              <w:keepNext w:val="false"/>
               <w:spacing w:after="0"/>
               <w:jc w:val="right"/>
             </w:pPr>
@@ -2344,22 +2550,23 @@
         </w:trPr>
         <w:tc>
           <w:tcPr>
-            <w:tcW w:type="dxa" w:w="4160"/>
-            <w:tcBorders>
-              <w:top w:val="single" w:color="BFBFBF" w:sz="4"/>
-              <w:left w:val="single" w:color="BFBFBF" w:sz="4"/>
-              <w:bottom w:val="single" w:color="BFBFBF" w:sz="4"/>
-              <w:right w:val="single" w:color="BFBFBF" w:sz="4"/>
-            </w:tcBorders>
-            <w:tcMar>
-              <w:top w:type="dxa" w:w="60"/>
-              <w:left w:type="dxa" w:w="100"/>
-              <w:bottom w:type="dxa" w:w="60"/>
-              <w:right w:type="dxa" w:w="100"/>
-            </w:tcMar>
-          </w:tcPr>
-          <w:p>
-            <w:pPr>
+            <w:tcW w:type="dxa" w:w="3860"/>
+            <w:tcBorders>
+              <w:top w:val="single" w:color="BFBFBF" w:sz="4"/>
+              <w:left w:val="single" w:color="BFBFBF" w:sz="4"/>
+              <w:bottom w:val="single" w:color="BFBFBF" w:sz="4"/>
+              <w:right w:val="single" w:color="BFBFBF" w:sz="4"/>
+            </w:tcBorders>
+            <w:tcMar>
+              <w:top w:type="dxa" w:w="60"/>
+              <w:left w:type="dxa" w:w="100"/>
+              <w:bottom w:type="dxa" w:w="60"/>
+              <w:right w:type="dxa" w:w="100"/>
+            </w:tcMar>
+          </w:tcPr>
+          <w:p>
+            <w:pPr>
+              <w:keepNext w:val="false"/>
               <w:spacing w:after="0"/>
               <w:jc w:val="left"/>
             </w:pPr>
@@ -2394,6 +2601,7 @@
           </w:tcPr>
           <w:p>
             <w:pPr>
+              <w:keepNext w:val="false"/>
               <w:spacing w:after="0"/>
               <w:jc w:val="right"/>
             </w:pPr>
@@ -2428,6 +2636,7 @@
           </w:tcPr>
           <w:p>
             <w:pPr>
+              <w:keepNext w:val="false"/>
               <w:spacing w:after="0"/>
               <w:jc w:val="right"/>
             </w:pPr>
@@ -2462,6 +2671,7 @@
           </w:tcPr>
           <w:p>
             <w:pPr>
+              <w:keepNext w:val="false"/>
               <w:spacing w:after="0"/>
               <w:jc w:val="right"/>
             </w:pPr>
@@ -2480,22 +2690,23 @@
         </w:tc>
         <w:tc>
           <w:tcPr>
-            <w:tcW w:type="dxa" w:w="1400"/>
-            <w:tcBorders>
-              <w:top w:val="single" w:color="BFBFBF" w:sz="4"/>
-              <w:left w:val="single" w:color="BFBFBF" w:sz="4"/>
-              <w:bottom w:val="single" w:color="BFBFBF" w:sz="4"/>
-              <w:right w:val="single" w:color="BFBFBF" w:sz="4"/>
-            </w:tcBorders>
-            <w:tcMar>
-              <w:top w:type="dxa" w:w="60"/>
-              <w:left w:type="dxa" w:w="100"/>
-              <w:bottom w:type="dxa" w:w="60"/>
-              <w:right w:type="dxa" w:w="100"/>
-            </w:tcMar>
-          </w:tcPr>
-          <w:p>
-            <w:pPr>
+            <w:tcW w:type="dxa" w:w="1700"/>
+            <w:tcBorders>
+              <w:top w:val="single" w:color="BFBFBF" w:sz="4"/>
+              <w:left w:val="single" w:color="BFBFBF" w:sz="4"/>
+              <w:bottom w:val="single" w:color="BFBFBF" w:sz="4"/>
+              <w:right w:val="single" w:color="BFBFBF" w:sz="4"/>
+            </w:tcBorders>
+            <w:tcMar>
+              <w:top w:type="dxa" w:w="60"/>
+              <w:left w:type="dxa" w:w="100"/>
+              <w:bottom w:type="dxa" w:w="60"/>
+              <w:right w:type="dxa" w:w="100"/>
+            </w:tcMar>
+          </w:tcPr>
+          <w:p>
+            <w:pPr>
+              <w:keepNext w:val="false"/>
               <w:spacing w:after="0"/>
               <w:jc w:val="right"/>
             </w:pPr>
@@ -2519,22 +2730,23 @@
         </w:trPr>
         <w:tc>
           <w:tcPr>
-            <w:tcW w:type="dxa" w:w="4160"/>
-            <w:tcBorders>
-              <w:top w:val="single" w:color="BFBFBF" w:sz="4"/>
-              <w:left w:val="single" w:color="BFBFBF" w:sz="4"/>
-              <w:bottom w:val="single" w:color="BFBFBF" w:sz="4"/>
-              <w:right w:val="single" w:color="BFBFBF" w:sz="4"/>
-            </w:tcBorders>
-            <w:tcMar>
-              <w:top w:type="dxa" w:w="60"/>
-              <w:left w:type="dxa" w:w="100"/>
-              <w:bottom w:type="dxa" w:w="60"/>
-              <w:right w:type="dxa" w:w="100"/>
-            </w:tcMar>
-          </w:tcPr>
-          <w:p>
-            <w:pPr>
+            <w:tcW w:type="dxa" w:w="3860"/>
+            <w:tcBorders>
+              <w:top w:val="single" w:color="BFBFBF" w:sz="4"/>
+              <w:left w:val="single" w:color="BFBFBF" w:sz="4"/>
+              <w:bottom w:val="single" w:color="BFBFBF" w:sz="4"/>
+              <w:right w:val="single" w:color="BFBFBF" w:sz="4"/>
+            </w:tcBorders>
+            <w:tcMar>
+              <w:top w:type="dxa" w:w="60"/>
+              <w:left w:type="dxa" w:w="100"/>
+              <w:bottom w:type="dxa" w:w="60"/>
+              <w:right w:type="dxa" w:w="100"/>
+            </w:tcMar>
+          </w:tcPr>
+          <w:p>
+            <w:pPr>
+              <w:keepNext w:val="false"/>
               <w:spacing w:after="0"/>
               <w:jc w:val="left"/>
             </w:pPr>
@@ -2569,6 +2781,7 @@
           </w:tcPr>
           <w:p>
             <w:pPr>
+              <w:keepNext w:val="false"/>
               <w:spacing w:after="0"/>
               <w:jc w:val="right"/>
             </w:pPr>
@@ -2603,6 +2816,7 @@
           </w:tcPr>
           <w:p>
             <w:pPr>
+              <w:keepNext w:val="false"/>
               <w:spacing w:after="0"/>
               <w:jc w:val="right"/>
             </w:pPr>
@@ -2637,6 +2851,7 @@
           </w:tcPr>
           <w:p>
             <w:pPr>
+              <w:keepNext w:val="false"/>
               <w:spacing w:after="0"/>
               <w:jc w:val="right"/>
             </w:pPr>
@@ -2655,22 +2870,23 @@
         </w:tc>
         <w:tc>
           <w:tcPr>
-            <w:tcW w:type="dxa" w:w="1400"/>
-            <w:tcBorders>
-              <w:top w:val="single" w:color="BFBFBF" w:sz="4"/>
-              <w:left w:val="single" w:color="BFBFBF" w:sz="4"/>
-              <w:bottom w:val="single" w:color="BFBFBF" w:sz="4"/>
-              <w:right w:val="single" w:color="BFBFBF" w:sz="4"/>
-            </w:tcBorders>
-            <w:tcMar>
-              <w:top w:type="dxa" w:w="60"/>
-              <w:left w:type="dxa" w:w="100"/>
-              <w:bottom w:type="dxa" w:w="60"/>
-              <w:right w:type="dxa" w:w="100"/>
-            </w:tcMar>
-          </w:tcPr>
-          <w:p>
-            <w:pPr>
+            <w:tcW w:type="dxa" w:w="1700"/>
+            <w:tcBorders>
+              <w:top w:val="single" w:color="BFBFBF" w:sz="4"/>
+              <w:left w:val="single" w:color="BFBFBF" w:sz="4"/>
+              <w:bottom w:val="single" w:color="BFBFBF" w:sz="4"/>
+              <w:right w:val="single" w:color="BFBFBF" w:sz="4"/>
+            </w:tcBorders>
+            <w:tcMar>
+              <w:top w:type="dxa" w:w="60"/>
+              <w:left w:type="dxa" w:w="100"/>
+              <w:bottom w:type="dxa" w:w="60"/>
+              <w:right w:type="dxa" w:w="100"/>
+            </w:tcMar>
+          </w:tcPr>
+          <w:p>
+            <w:pPr>
+              <w:keepNext w:val="false"/>
               <w:spacing w:after="0"/>
               <w:jc w:val="right"/>
             </w:pPr>
@@ -2694,22 +2910,23 @@
         </w:trPr>
         <w:tc>
           <w:tcPr>
-            <w:tcW w:type="dxa" w:w="4160"/>
-            <w:tcBorders>
-              <w:top w:val="single" w:color="BFBFBF" w:sz="4"/>
-              <w:left w:val="single" w:color="BFBFBF" w:sz="4"/>
-              <w:bottom w:val="single" w:color="BFBFBF" w:sz="4"/>
-              <w:right w:val="single" w:color="BFBFBF" w:sz="4"/>
-            </w:tcBorders>
-            <w:tcMar>
-              <w:top w:type="dxa" w:w="60"/>
-              <w:left w:type="dxa" w:w="100"/>
-              <w:bottom w:type="dxa" w:w="60"/>
-              <w:right w:type="dxa" w:w="100"/>
-            </w:tcMar>
-          </w:tcPr>
-          <w:p>
-            <w:pPr>
+            <w:tcW w:type="dxa" w:w="3860"/>
+            <w:tcBorders>
+              <w:top w:val="single" w:color="BFBFBF" w:sz="4"/>
+              <w:left w:val="single" w:color="BFBFBF" w:sz="4"/>
+              <w:bottom w:val="single" w:color="BFBFBF" w:sz="4"/>
+              <w:right w:val="single" w:color="BFBFBF" w:sz="4"/>
+            </w:tcBorders>
+            <w:tcMar>
+              <w:top w:type="dxa" w:w="60"/>
+              <w:left w:type="dxa" w:w="100"/>
+              <w:bottom w:type="dxa" w:w="60"/>
+              <w:right w:type="dxa" w:w="100"/>
+            </w:tcMar>
+          </w:tcPr>
+          <w:p>
+            <w:pPr>
+              <w:keepNext w:val="false"/>
               <w:spacing w:after="0"/>
               <w:jc w:val="left"/>
             </w:pPr>
@@ -2744,6 +2961,7 @@
           </w:tcPr>
           <w:p>
             <w:pPr>
+              <w:keepNext w:val="false"/>
               <w:spacing w:after="0"/>
               <w:jc w:val="right"/>
             </w:pPr>
@@ -2778,6 +2996,7 @@
           </w:tcPr>
           <w:p>
             <w:pPr>
+              <w:keepNext w:val="false"/>
               <w:spacing w:after="0"/>
               <w:jc w:val="right"/>
             </w:pPr>
@@ -2812,6 +3031,7 @@
           </w:tcPr>
           <w:p>
             <w:pPr>
+              <w:keepNext w:val="false"/>
               <w:spacing w:after="0"/>
               <w:jc w:val="right"/>
             </w:pPr>
@@ -2830,22 +3050,23 @@
         </w:tc>
         <w:tc>
           <w:tcPr>
-            <w:tcW w:type="dxa" w:w="1400"/>
-            <w:tcBorders>
-              <w:top w:val="single" w:color="BFBFBF" w:sz="4"/>
-              <w:left w:val="single" w:color="BFBFBF" w:sz="4"/>
-              <w:bottom w:val="single" w:color="BFBFBF" w:sz="4"/>
-              <w:right w:val="single" w:color="BFBFBF" w:sz="4"/>
-            </w:tcBorders>
-            <w:tcMar>
-              <w:top w:type="dxa" w:w="60"/>
-              <w:left w:type="dxa" w:w="100"/>
-              <w:bottom w:type="dxa" w:w="60"/>
-              <w:right w:type="dxa" w:w="100"/>
-            </w:tcMar>
-          </w:tcPr>
-          <w:p>
-            <w:pPr>
+            <w:tcW w:type="dxa" w:w="1700"/>
+            <w:tcBorders>
+              <w:top w:val="single" w:color="BFBFBF" w:sz="4"/>
+              <w:left w:val="single" w:color="BFBFBF" w:sz="4"/>
+              <w:bottom w:val="single" w:color="BFBFBF" w:sz="4"/>
+              <w:right w:val="single" w:color="BFBFBF" w:sz="4"/>
+            </w:tcBorders>
+            <w:tcMar>
+              <w:top w:type="dxa" w:w="60"/>
+              <w:left w:type="dxa" w:w="100"/>
+              <w:bottom w:type="dxa" w:w="60"/>
+              <w:right w:type="dxa" w:w="100"/>
+            </w:tcMar>
+          </w:tcPr>
+          <w:p>
+            <w:pPr>
+              <w:keepNext w:val="false"/>
               <w:spacing w:after="0"/>
               <w:jc w:val="right"/>
             </w:pPr>
@@ -2869,22 +3090,23 @@
         </w:trPr>
         <w:tc>
           <w:tcPr>
-            <w:tcW w:type="dxa" w:w="4160"/>
-            <w:tcBorders>
-              <w:top w:val="single" w:color="BFBFBF" w:sz="4"/>
-              <w:left w:val="single" w:color="BFBFBF" w:sz="4"/>
-              <w:bottom w:val="single" w:color="BFBFBF" w:sz="4"/>
-              <w:right w:val="single" w:color="BFBFBF" w:sz="4"/>
-            </w:tcBorders>
-            <w:tcMar>
-              <w:top w:type="dxa" w:w="60"/>
-              <w:left w:type="dxa" w:w="100"/>
-              <w:bottom w:type="dxa" w:w="60"/>
-              <w:right w:type="dxa" w:w="100"/>
-            </w:tcMar>
-          </w:tcPr>
-          <w:p>
-            <w:pPr>
+            <w:tcW w:type="dxa" w:w="3860"/>
+            <w:tcBorders>
+              <w:top w:val="single" w:color="BFBFBF" w:sz="4"/>
+              <w:left w:val="single" w:color="BFBFBF" w:sz="4"/>
+              <w:bottom w:val="single" w:color="BFBFBF" w:sz="4"/>
+              <w:right w:val="single" w:color="BFBFBF" w:sz="4"/>
+            </w:tcBorders>
+            <w:tcMar>
+              <w:top w:type="dxa" w:w="60"/>
+              <w:left w:type="dxa" w:w="100"/>
+              <w:bottom w:type="dxa" w:w="60"/>
+              <w:right w:type="dxa" w:w="100"/>
+            </w:tcMar>
+          </w:tcPr>
+          <w:p>
+            <w:pPr>
+              <w:keepNext w:val="false"/>
               <w:spacing w:after="0"/>
               <w:jc w:val="left"/>
             </w:pPr>
@@ -2919,6 +3141,7 @@
           </w:tcPr>
           <w:p>
             <w:pPr>
+              <w:keepNext w:val="false"/>
               <w:spacing w:after="0"/>
               <w:jc w:val="right"/>
             </w:pPr>
@@ -2953,6 +3176,7 @@
           </w:tcPr>
           <w:p>
             <w:pPr>
+              <w:keepNext w:val="false"/>
               <w:spacing w:after="0"/>
               <w:jc w:val="right"/>
             </w:pPr>
@@ -2987,6 +3211,7 @@
           </w:tcPr>
           <w:p>
             <w:pPr>
+              <w:keepNext w:val="false"/>
               <w:spacing w:after="0"/>
               <w:jc w:val="right"/>
             </w:pPr>
@@ -3005,22 +3230,23 @@
         </w:tc>
         <w:tc>
           <w:tcPr>
-            <w:tcW w:type="dxa" w:w="1400"/>
-            <w:tcBorders>
-              <w:top w:val="single" w:color="BFBFBF" w:sz="4"/>
-              <w:left w:val="single" w:color="BFBFBF" w:sz="4"/>
-              <w:bottom w:val="single" w:color="BFBFBF" w:sz="4"/>
-              <w:right w:val="single" w:color="BFBFBF" w:sz="4"/>
-            </w:tcBorders>
-            <w:tcMar>
-              <w:top w:type="dxa" w:w="60"/>
-              <w:left w:type="dxa" w:w="100"/>
-              <w:bottom w:type="dxa" w:w="60"/>
-              <w:right w:type="dxa" w:w="100"/>
-            </w:tcMar>
-          </w:tcPr>
-          <w:p>
-            <w:pPr>
+            <w:tcW w:type="dxa" w:w="1700"/>
+            <w:tcBorders>
+              <w:top w:val="single" w:color="BFBFBF" w:sz="4"/>
+              <w:left w:val="single" w:color="BFBFBF" w:sz="4"/>
+              <w:bottom w:val="single" w:color="BFBFBF" w:sz="4"/>
+              <w:right w:val="single" w:color="BFBFBF" w:sz="4"/>
+            </w:tcBorders>
+            <w:tcMar>
+              <w:top w:type="dxa" w:w="60"/>
+              <w:left w:type="dxa" w:w="100"/>
+              <w:bottom w:type="dxa" w:w="60"/>
+              <w:right w:type="dxa" w:w="100"/>
+            </w:tcMar>
+          </w:tcPr>
+          <w:p>
+            <w:pPr>
+              <w:keepNext w:val="false"/>
               <w:spacing w:after="0"/>
               <w:jc w:val="right"/>
             </w:pPr>
@@ -3044,22 +3270,23 @@
         </w:trPr>
         <w:tc>
           <w:tcPr>
-            <w:tcW w:type="dxa" w:w="4160"/>
-            <w:tcBorders>
-              <w:top w:val="single" w:color="BFBFBF" w:sz="4"/>
-              <w:left w:val="single" w:color="BFBFBF" w:sz="4"/>
-              <w:bottom w:val="single" w:color="BFBFBF" w:sz="4"/>
-              <w:right w:val="single" w:color="BFBFBF" w:sz="4"/>
-            </w:tcBorders>
-            <w:tcMar>
-              <w:top w:type="dxa" w:w="60"/>
-              <w:left w:type="dxa" w:w="100"/>
-              <w:bottom w:type="dxa" w:w="60"/>
-              <w:right w:type="dxa" w:w="100"/>
-            </w:tcMar>
-          </w:tcPr>
-          <w:p>
-            <w:pPr>
+            <w:tcW w:type="dxa" w:w="3860"/>
+            <w:tcBorders>
+              <w:top w:val="single" w:color="BFBFBF" w:sz="4"/>
+              <w:left w:val="single" w:color="BFBFBF" w:sz="4"/>
+              <w:bottom w:val="single" w:color="BFBFBF" w:sz="4"/>
+              <w:right w:val="single" w:color="BFBFBF" w:sz="4"/>
+            </w:tcBorders>
+            <w:tcMar>
+              <w:top w:type="dxa" w:w="60"/>
+              <w:left w:type="dxa" w:w="100"/>
+              <w:bottom w:type="dxa" w:w="60"/>
+              <w:right w:type="dxa" w:w="100"/>
+            </w:tcMar>
+          </w:tcPr>
+          <w:p>
+            <w:pPr>
+              <w:keepNext w:val="false"/>
               <w:spacing w:after="0"/>
               <w:jc w:val="left"/>
             </w:pPr>
@@ -3094,6 +3321,7 @@
           </w:tcPr>
           <w:p>
             <w:pPr>
+              <w:keepNext w:val="false"/>
               <w:spacing w:after="0"/>
               <w:jc w:val="right"/>
             </w:pPr>
@@ -3128,6 +3356,7 @@
           </w:tcPr>
           <w:p>
             <w:pPr>
+              <w:keepNext w:val="false"/>
               <w:spacing w:after="0"/>
               <w:jc w:val="right"/>
             </w:pPr>
@@ -3162,6 +3391,7 @@
           </w:tcPr>
           <w:p>
             <w:pPr>
+              <w:keepNext w:val="false"/>
               <w:spacing w:after="0"/>
               <w:jc w:val="right"/>
             </w:pPr>
@@ -3180,22 +3410,23 @@
         </w:tc>
         <w:tc>
           <w:tcPr>
-            <w:tcW w:type="dxa" w:w="1400"/>
-            <w:tcBorders>
-              <w:top w:val="single" w:color="BFBFBF" w:sz="4"/>
-              <w:left w:val="single" w:color="BFBFBF" w:sz="4"/>
-              <w:bottom w:val="single" w:color="BFBFBF" w:sz="4"/>
-              <w:right w:val="single" w:color="BFBFBF" w:sz="4"/>
-            </w:tcBorders>
-            <w:tcMar>
-              <w:top w:type="dxa" w:w="60"/>
-              <w:left w:type="dxa" w:w="100"/>
-              <w:bottom w:type="dxa" w:w="60"/>
-              <w:right w:type="dxa" w:w="100"/>
-            </w:tcMar>
-          </w:tcPr>
-          <w:p>
-            <w:pPr>
+            <w:tcW w:type="dxa" w:w="1700"/>
+            <w:tcBorders>
+              <w:top w:val="single" w:color="BFBFBF" w:sz="4"/>
+              <w:left w:val="single" w:color="BFBFBF" w:sz="4"/>
+              <w:bottom w:val="single" w:color="BFBFBF" w:sz="4"/>
+              <w:right w:val="single" w:color="BFBFBF" w:sz="4"/>
+            </w:tcBorders>
+            <w:tcMar>
+              <w:top w:type="dxa" w:w="60"/>
+              <w:left w:type="dxa" w:w="100"/>
+              <w:bottom w:type="dxa" w:w="60"/>
+              <w:right w:type="dxa" w:w="100"/>
+            </w:tcMar>
+          </w:tcPr>
+          <w:p>
+            <w:pPr>
+              <w:keepNext w:val="false"/>
               <w:spacing w:after="0"/>
               <w:jc w:val="right"/>
             </w:pPr>
@@ -3239,7 +3470,7 @@
       <w:r>
         <w:drawing>
           <wp:inline distT="0" distB="0" distL="0" distR="0">
-            <wp:extent cx="5762625" cy="2466975"/>
+            <wp:extent cx="5848350" cy="2476500"/>
             <wp:effectExtent t="0" r="0" b="0" l="0"/>
             <wp:docPr id="1" name=""/>
             <wp:cNvGraphicFramePr>
@@ -3264,7 +3495,7 @@
                   <pic:spPr bwMode="auto">
                     <a:xfrm>
                       <a:off x="0" y="0"/>
-                      <a:ext cx="5762625" cy="2466975"/>
+                      <a:ext cx="5848350" cy="2476500"/>
                     </a:xfrm>
                     <a:prstGeom prst="rect">
                       <a:avLst/>
@@ -3291,7 +3522,7 @@
           <w:sz w:val="19"/>
           <w:szCs w:val="19"/>
         </w:rPr>
-        <w:t xml:space="preserve">Figure 1. Test-set recall, precision, F1 and ROC-AUC by model.</w:t>
+        <w:t xml:space="preserve">Figure 1. Share of defaulters caught, precision and risk-ranking quality of each technique on the held-out applicants.</w:t>
       </w:r>
     </w:p>
     <w:p>
@@ -3350,7 +3581,7 @@
       <w:r>
         <w:drawing>
           <wp:inline distT="0" distB="0" distL="0" distR="0">
-            <wp:extent cx="5486400" cy="2924175"/>
+            <wp:extent cx="5848350" cy="2476500"/>
             <wp:effectExtent t="0" r="0" b="0" l="0"/>
             <wp:docPr id="2" name=""/>
             <wp:cNvGraphicFramePr>
@@ -3375,7 +3606,7 @@
                   <pic:spPr bwMode="auto">
                     <a:xfrm>
                       <a:off x="0" y="0"/>
-                      <a:ext cx="5486400" cy="2924175"/>
+                      <a:ext cx="5848350" cy="2476500"/>
                     </a:xfrm>
                     <a:prstGeom prst="rect">
                       <a:avLst/>
@@ -3437,7 +3668,7 @@
       <w:r>
         <w:drawing>
           <wp:inline distT="0" distB="0" distL="0" distR="0">
-            <wp:extent cx="4752975" cy="3657600"/>
+            <wp:extent cx="5391150" cy="2733675"/>
             <wp:effectExtent t="0" r="0" b="0" l="0"/>
             <wp:docPr id="3" name=""/>
             <wp:cNvGraphicFramePr>
@@ -3462,7 +3693,7 @@
                   <pic:spPr bwMode="auto">
                     <a:xfrm>
                       <a:off x="0" y="0"/>
-                      <a:ext cx="4752975" cy="3657600"/>
+                      <a:ext cx="5391150" cy="2733675"/>
                     </a:xfrm>
                     <a:prstGeom prst="rect">
                       <a:avLst/>
@@ -3489,7 +3720,7 @@
           <w:sz w:val="19"/>
           <w:szCs w:val="19"/>
         </w:rPr>
-        <w:t xml:space="preserve">Figure 3. Feature importance of the tuned Random Forest. The debt-to-income ratio and its missing-value flag account for more than half of the model's decision power.</w:t>
+        <w:t xml:space="preserve">Figure 3. The twelve inputs the Random Forest relies on most. The debt-to-income ratio and its missing-value flag together carry more than half (52.6%) of the model's decision power.</w:t>
       </w:r>
     </w:p>
     <w:p>
@@ -3912,6 +4143,7 @@
           </w:tcPr>
           <w:p>
             <w:pPr>
+              <w:keepNext w:val="false"/>
               <w:spacing w:after="0"/>
               <w:jc w:val="left"/>
             </w:pPr>
@@ -3947,6 +4179,7 @@
           </w:tcPr>
           <w:p>
             <w:pPr>
+              <w:keepNext w:val="false"/>
               <w:spacing w:after="0"/>
               <w:jc w:val="left"/>
             </w:pPr>
@@ -3986,6 +4219,7 @@
           </w:tcPr>
           <w:p>
             <w:pPr>
+              <w:keepNext w:val="false"/>
               <w:spacing w:after="0"/>
               <w:jc w:val="left"/>
             </w:pPr>
@@ -4020,6 +4254,7 @@
           </w:tcPr>
           <w:p>
             <w:pPr>
+              <w:keepNext w:val="false"/>
               <w:spacing w:after="0"/>
               <w:jc w:val="left"/>
             </w:pPr>
@@ -4059,6 +4294,7 @@
           </w:tcPr>
           <w:p>
             <w:pPr>
+              <w:keepNext w:val="false"/>
               <w:spacing w:after="0"/>
               <w:jc w:val="left"/>
             </w:pPr>
@@ -4093,6 +4329,7 @@
           </w:tcPr>
           <w:p>
             <w:pPr>
+              <w:keepNext w:val="false"/>
               <w:spacing w:after="0"/>
               <w:jc w:val="left"/>
             </w:pPr>
@@ -4132,6 +4369,7 @@
           </w:tcPr>
           <w:p>
             <w:pPr>
+              <w:keepNext w:val="false"/>
               <w:spacing w:after="0"/>
               <w:jc w:val="left"/>
             </w:pPr>
@@ -4166,6 +4404,7 @@
           </w:tcPr>
           <w:p>
             <w:pPr>
+              <w:keepNext w:val="false"/>
               <w:spacing w:after="0"/>
               <w:jc w:val="left"/>
             </w:pPr>
@@ -4205,6 +4444,7 @@
           </w:tcPr>
           <w:p>
             <w:pPr>
+              <w:keepNext w:val="false"/>
               <w:spacing w:after="0"/>
               <w:jc w:val="left"/>
             </w:pPr>
@@ -4239,6 +4479,7 @@
           </w:tcPr>
           <w:p>
             <w:pPr>
+              <w:keepNext w:val="false"/>
               <w:spacing w:after="0"/>
               <w:jc w:val="left"/>
             </w:pPr>
@@ -4278,6 +4519,7 @@
           </w:tcPr>
           <w:p>
             <w:pPr>
+              <w:keepNext w:val="false"/>
               <w:spacing w:after="0"/>
               <w:jc w:val="left"/>
             </w:pPr>
@@ -4312,6 +4554,7 @@
           </w:tcPr>
           <w:p>
             <w:pPr>
+              <w:keepNext w:val="false"/>
               <w:spacing w:after="0"/>
               <w:jc w:val="left"/>
             </w:pPr>
@@ -4351,6 +4594,7 @@
           </w:tcPr>
           <w:p>
             <w:pPr>
+              <w:keepNext w:val="false"/>
               <w:spacing w:after="0"/>
               <w:jc w:val="left"/>
             </w:pPr>
@@ -4385,6 +4629,7 @@
           </w:tcPr>
           <w:p>
             <w:pPr>
+              <w:keepNext w:val="false"/>
               <w:spacing w:after="0"/>
               <w:jc w:val="left"/>
             </w:pPr>
@@ -4500,6 +4745,7 @@
           </w:tcPr>
           <w:p>
             <w:pPr>
+              <w:keepNext/>
               <w:spacing w:after="0"/>
               <w:jc w:val="left"/>
             </w:pPr>
@@ -4535,6 +4781,7 @@
           </w:tcPr>
           <w:p>
             <w:pPr>
+              <w:keepNext/>
               <w:spacing w:after="0"/>
               <w:jc w:val="left"/>
             </w:pPr>
@@ -4570,6 +4817,7 @@
           </w:tcPr>
           <w:p>
             <w:pPr>
+              <w:keepNext/>
               <w:spacing w:after="0"/>
               <w:jc w:val="left"/>
             </w:pPr>
@@ -4609,6 +4857,7 @@
           </w:tcPr>
           <w:p>
             <w:pPr>
+              <w:keepNext/>
               <w:spacing w:after="0"/>
               <w:jc w:val="left"/>
             </w:pPr>
@@ -4643,6 +4892,7 @@
           </w:tcPr>
           <w:p>
             <w:pPr>
+              <w:keepNext/>
               <w:spacing w:after="0"/>
               <w:jc w:val="left"/>
             </w:pPr>
@@ -4677,6 +4927,7 @@
           </w:tcPr>
           <w:p>
             <w:pPr>
+              <w:keepNext/>
               <w:spacing w:after="0"/>
               <w:jc w:val="left"/>
             </w:pPr>
@@ -4716,6 +4967,7 @@
           </w:tcPr>
           <w:p>
             <w:pPr>
+              <w:keepNext/>
               <w:spacing w:after="0"/>
               <w:jc w:val="left"/>
             </w:pPr>
@@ -4750,6 +5002,7 @@
           </w:tcPr>
           <w:p>
             <w:pPr>
+              <w:keepNext/>
               <w:spacing w:after="0"/>
               <w:jc w:val="left"/>
             </w:pPr>
@@ -4784,6 +5037,7 @@
           </w:tcPr>
           <w:p>
             <w:pPr>
+              <w:keepNext/>
               <w:spacing w:after="0"/>
               <w:jc w:val="left"/>
             </w:pPr>
@@ -4823,6 +5077,7 @@
           </w:tcPr>
           <w:p>
             <w:pPr>
+              <w:keepNext/>
               <w:spacing w:after="0"/>
               <w:jc w:val="left"/>
             </w:pPr>
@@ -4857,6 +5112,7 @@
           </w:tcPr>
           <w:p>
             <w:pPr>
+              <w:keepNext/>
               <w:spacing w:after="0"/>
               <w:jc w:val="left"/>
             </w:pPr>
@@ -4891,6 +5147,7 @@
           </w:tcPr>
           <w:p>
             <w:pPr>
+              <w:keepNext/>
               <w:spacing w:after="0"/>
               <w:jc w:val="left"/>
             </w:pPr>
@@ -4930,6 +5187,7 @@
           </w:tcPr>
           <w:p>
             <w:pPr>
+              <w:keepNext/>
               <w:spacing w:after="0"/>
               <w:jc w:val="left"/>
             </w:pPr>
@@ -4964,6 +5222,7 @@
           </w:tcPr>
           <w:p>
             <w:pPr>
+              <w:keepNext/>
               <w:spacing w:after="0"/>
               <w:jc w:val="left"/>
             </w:pPr>
@@ -4998,6 +5257,7 @@
           </w:tcPr>
           <w:p>
             <w:pPr>
+              <w:keepNext/>
               <w:spacing w:after="0"/>
               <w:jc w:val="left"/>
             </w:pPr>
@@ -5037,6 +5297,7 @@
           </w:tcPr>
           <w:p>
             <w:pPr>
+              <w:keepNext w:val="false"/>
               <w:spacing w:after="0"/>
               <w:jc w:val="left"/>
             </w:pPr>
@@ -5071,6 +5332,7 @@
           </w:tcPr>
           <w:p>
             <w:pPr>
+              <w:keepNext w:val="false"/>
               <w:spacing w:after="0"/>
               <w:jc w:val="left"/>
             </w:pPr>
@@ -5105,6 +5367,7 @@
           </w:tcPr>
           <w:p>
             <w:pPr>
+              <w:keepNext w:val="false"/>
               <w:spacing w:after="0"/>
               <w:jc w:val="left"/>
             </w:pPr>
@@ -5247,6 +5510,7 @@
           </w:tcPr>
           <w:p>
             <w:pPr>
+              <w:keepNext w:val="false"/>
               <w:spacing w:after="0"/>
               <w:jc w:val="left"/>
             </w:pPr>
@@ -5282,6 +5546,7 @@
           </w:tcPr>
           <w:p>
             <w:pPr>
+              <w:keepNext w:val="false"/>
               <w:spacing w:after="0"/>
               <w:jc w:val="left"/>
             </w:pPr>
@@ -5317,6 +5582,7 @@
           </w:tcPr>
           <w:p>
             <w:pPr>
+              <w:keepNext w:val="false"/>
               <w:spacing w:after="0"/>
               <w:jc w:val="left"/>
             </w:pPr>
@@ -5356,6 +5622,7 @@
           </w:tcPr>
           <w:p>
             <w:pPr>
+              <w:keepNext w:val="false"/>
               <w:spacing w:after="0"/>
               <w:jc w:val="left"/>
             </w:pPr>
@@ -5390,6 +5657,7 @@
           </w:tcPr>
           <w:p>
             <w:pPr>
+              <w:keepNext w:val="false"/>
               <w:spacing w:after="0"/>
               <w:jc w:val="left"/>
             </w:pPr>
@@ -5424,6 +5692,7 @@
           </w:tcPr>
           <w:p>
             <w:pPr>
+              <w:keepNext w:val="false"/>
               <w:spacing w:after="0"/>
               <w:jc w:val="left"/>
             </w:pPr>
@@ -5463,6 +5732,7 @@
           </w:tcPr>
           <w:p>
             <w:pPr>
+              <w:keepNext w:val="false"/>
               <w:spacing w:after="0"/>
               <w:jc w:val="left"/>
             </w:pPr>
@@ -5497,6 +5767,7 @@
           </w:tcPr>
           <w:p>
             <w:pPr>
+              <w:keepNext w:val="false"/>
               <w:spacing w:after="0"/>
               <w:jc w:val="left"/>
             </w:pPr>
@@ -5531,6 +5802,7 @@
           </w:tcPr>
           <w:p>
             <w:pPr>
+              <w:keepNext w:val="false"/>
               <w:spacing w:after="0"/>
               <w:jc w:val="left"/>
             </w:pPr>
@@ -5570,6 +5842,7 @@
           </w:tcPr>
           <w:p>
             <w:pPr>
+              <w:keepNext w:val="false"/>
               <w:spacing w:after="0"/>
               <w:jc w:val="left"/>
             </w:pPr>
@@ -5604,6 +5877,7 @@
           </w:tcPr>
           <w:p>
             <w:pPr>
+              <w:keepNext w:val="false"/>
               <w:spacing w:after="0"/>
               <w:jc w:val="left"/>
             </w:pPr>
@@ -5638,6 +5912,7 @@
           </w:tcPr>
           <w:p>
             <w:pPr>
+              <w:keepNext w:val="false"/>
               <w:spacing w:after="0"/>
               <w:jc w:val="left"/>
             </w:pPr>
@@ -5677,6 +5952,7 @@
           </w:tcPr>
           <w:p>
             <w:pPr>
+              <w:keepNext w:val="false"/>
               <w:spacing w:after="0"/>
               <w:jc w:val="left"/>
             </w:pPr>
@@ -5711,6 +5987,7 @@
           </w:tcPr>
           <w:p>
             <w:pPr>
+              <w:keepNext w:val="false"/>
               <w:spacing w:after="0"/>
               <w:jc w:val="left"/>
             </w:pPr>
@@ -5745,6 +6022,7 @@
           </w:tcPr>
           <w:p>
             <w:pPr>
+              <w:keepNext w:val="false"/>
               <w:spacing w:after="0"/>
               <w:jc w:val="left"/>
             </w:pPr>
@@ -5784,6 +6062,7 @@
           </w:tcPr>
           <w:p>
             <w:pPr>
+              <w:keepNext w:val="false"/>
               <w:spacing w:after="0"/>
               <w:jc w:val="left"/>
             </w:pPr>
@@ -5818,6 +6097,7 @@
           </w:tcPr>
           <w:p>
             <w:pPr>
+              <w:keepNext w:val="false"/>
               <w:spacing w:after="0"/>
               <w:jc w:val="left"/>
             </w:pPr>
@@ -5852,6 +6132,7 @@
           </w:tcPr>
           <w:p>
             <w:pPr>
+              <w:keepNext w:val="false"/>
               <w:spacing w:after="0"/>
               <w:jc w:val="left"/>
             </w:pPr>
@@ -5891,6 +6172,7 @@
           </w:tcPr>
           <w:p>
             <w:pPr>
+              <w:keepNext w:val="false"/>
               <w:spacing w:after="0"/>
               <w:jc w:val="left"/>
             </w:pPr>
@@ -5925,6 +6207,7 @@
           </w:tcPr>
           <w:p>
             <w:pPr>
+              <w:keepNext w:val="false"/>
               <w:spacing w:after="0"/>
               <w:jc w:val="left"/>
             </w:pPr>
@@ -5959,6 +6242,7 @@
           </w:tcPr>
           <w:p>
             <w:pPr>
+              <w:keepNext w:val="false"/>
               <w:spacing w:after="0"/>
               <w:jc w:val="left"/>
             </w:pPr>
@@ -5998,6 +6282,7 @@
           </w:tcPr>
           <w:p>
             <w:pPr>
+              <w:keepNext w:val="false"/>
               <w:spacing w:after="0"/>
               <w:jc w:val="left"/>
             </w:pPr>
@@ -6032,6 +6317,7 @@
           </w:tcPr>
           <w:p>
             <w:pPr>
+              <w:keepNext w:val="false"/>
               <w:spacing w:after="0"/>
               <w:jc w:val="left"/>
             </w:pPr>
@@ -6066,6 +6352,7 @@
           </w:tcPr>
           <w:p>
             <w:pPr>
+              <w:keepNext w:val="false"/>
               <w:spacing w:after="0"/>
               <w:jc w:val="left"/>
             </w:pPr>
@@ -6329,7 +6616,7 @@
       <w:r>
         <w:drawing>
           <wp:inline distT="0" distB="0" distL="0" distR="0">
-            <wp:extent cx="5762625" cy="2381250"/>
+            <wp:extent cx="5848350" cy="2476500"/>
             <wp:effectExtent t="0" r="0" b="0" l="0"/>
             <wp:docPr id="4" name=""/>
             <wp:cNvGraphicFramePr>
@@ -6354,7 +6641,7 @@
                   <pic:spPr bwMode="auto">
                     <a:xfrm>
                       <a:off x="0" y="0"/>
-                      <a:ext cx="5762625" cy="2381250"/>
+                      <a:ext cx="5848350" cy="2476500"/>
                     </a:xfrm>
                     <a:prstGeom prst="rect">
                       <a:avLst/>
@@ -6392,7 +6679,7 @@
       <w:r>
         <w:drawing>
           <wp:inline distT="0" distB="0" distL="0" distR="0">
-            <wp:extent cx="6038850" cy="1600200"/>
+            <wp:extent cx="6038850" cy="1952625"/>
             <wp:effectExtent t="0" r="0" b="0" l="0"/>
             <wp:docPr id="5" name=""/>
             <wp:cNvGraphicFramePr>
@@ -6417,7 +6704,7 @@
                   <pic:spPr bwMode="auto">
                     <a:xfrm>
                       <a:off x="0" y="0"/>
-                      <a:ext cx="6038850" cy="1600200"/>
+                      <a:ext cx="6038850" cy="1952625"/>
                     </a:xfrm>
                     <a:prstGeom prst="rect">
                       <a:avLst/>
@@ -6455,7 +6742,7 @@
       <w:r>
         <w:drawing>
           <wp:inline distT="0" distB="0" distL="0" distR="0">
-            <wp:extent cx="6038850" cy="1600200"/>
+            <wp:extent cx="6038850" cy="1952625"/>
             <wp:effectExtent t="0" r="0" b="0" l="0"/>
             <wp:docPr id="6" name=""/>
             <wp:cNvGraphicFramePr>
@@ -6480,7 +6767,7 @@
                   <pic:spPr bwMode="auto">
                     <a:xfrm>
                       <a:off x="0" y="0"/>
-                      <a:ext cx="6038850" cy="1600200"/>
+                      <a:ext cx="6038850" cy="1952625"/>
                     </a:xfrm>
                     <a:prstGeom prst="rect">
                       <a:avLst/>
@@ -6510,52 +6797,610 @@
         <w:t xml:space="preserve">Figure A3. Default rate by number of derogatory reports, delinquent credit lines and recent credit inquiries.</w:t>
       </w:r>
     </w:p>
-    <w:p>
-      <w:pPr>
-        <w:spacing w:after="60" w:before="120"/>
-        <w:jc w:val="center"/>
-      </w:pPr>
-      <w:r>
-        <w:drawing>
-          <wp:inline distT="0" distB="0" distL="0" distR="0">
-            <wp:extent cx="3838575" cy="3295650"/>
-            <wp:effectExtent t="0" r="0" b="0" l="0"/>
-            <wp:docPr id="7" name=""/>
-            <wp:cNvGraphicFramePr>
-              <a:graphicFrameLocks xmlns:a="http://schemas.openxmlformats.org/drawingml/2006/main" noChangeAspect="1"/>
-            </wp:cNvGraphicFramePr>
-            <a:graphic xmlns:a="http://schemas.openxmlformats.org/drawingml/2006/main">
-              <a:graphicData uri="http://schemas.openxmlformats.org/drawingml/2006/picture">
-                <pic:pic xmlns:pic="http://schemas.openxmlformats.org/drawingml/2006/picture">
-                  <pic:nvPicPr>
-                    <pic:cNvPr id="0" name="" descr=""/>
-                    <pic:cNvPicPr>
-                      <a:picLocks noChangeAspect="1" noChangeArrowheads="1"/>
-                    </pic:cNvPicPr>
-                  </pic:nvPicPr>
-                  <pic:blipFill>
-                    <a:blip r:embed="rId14" cstate="none"/>
-                    <a:srcRect/>
-                    <a:stretch>
-                      <a:fillRect/>
-                    </a:stretch>
-                  </pic:blipFill>
-                  <pic:spPr bwMode="auto">
-                    <a:xfrm>
-                      <a:off x="0" y="0"/>
-                      <a:ext cx="3838575" cy="3295650"/>
-                    </a:xfrm>
-                    <a:prstGeom prst="rect">
-                      <a:avLst/>
-                    </a:prstGeom>
-                  </pic:spPr>
-                </pic:pic>
-              </a:graphicData>
-            </a:graphic>
-          </wp:inline>
-        </w:drawing>
-      </w:r>
-    </w:p>
+    <w:tbl>
+      <w:tblPr>
+        <w:tblW w:type="dxa" w:w="9360"/>
+        <w:tblBorders>
+          <w:top w:val="single" w:color="auto" w:sz="4"/>
+          <w:left w:val="single" w:color="auto" w:sz="4"/>
+          <w:bottom w:val="single" w:color="auto" w:sz="4"/>
+          <w:right w:val="single" w:color="auto" w:sz="4"/>
+          <w:insideH w:val="single" w:color="auto" w:sz="4"/>
+          <w:insideV w:val="single" w:color="auto" w:sz="4"/>
+        </w:tblBorders>
+      </w:tblPr>
+      <w:tblGrid>
+        <w:gridCol w:w="3460"/>
+        <w:gridCol w:w="2000"/>
+        <w:gridCol w:w="2300"/>
+        <w:gridCol w:w="1600"/>
+      </w:tblGrid>
+      <w:tr>
+        <w:trPr>
+          <w:cantSplit/>
+          <w:tblHeader/>
+        </w:trPr>
+        <w:tc>
+          <w:tcPr>
+            <w:tcW w:type="dxa" w:w="3460"/>
+            <w:tcBorders>
+              <w:top w:val="single" w:color="BFBFBF" w:sz="4"/>
+              <w:left w:val="single" w:color="BFBFBF" w:sz="4"/>
+              <w:bottom w:val="single" w:color="BFBFBF" w:sz="4"/>
+              <w:right w:val="single" w:color="BFBFBF" w:sz="4"/>
+            </w:tcBorders>
+            <w:shd w:fill="1E2761" w:color="auto" w:val="clear"/>
+            <w:tcMar>
+              <w:top w:type="dxa" w:w="60"/>
+              <w:left w:type="dxa" w:w="100"/>
+              <w:bottom w:type="dxa" w:w="60"/>
+              <w:right w:type="dxa" w:w="100"/>
+            </w:tcMar>
+          </w:tcPr>
+          <w:p>
+            <w:pPr>
+              <w:keepNext/>
+              <w:spacing w:after="0"/>
+              <w:jc w:val="left"/>
+            </w:pPr>
+            <w:r>
+              <w:rPr>
+                <w:rFonts w:ascii="Calibri" w:cs="Calibri" w:eastAsia="Calibri" w:hAnsi="Calibri"/>
+                <w:b/>
+                <w:bCs/>
+                <w:color w:val="FFFFFF"/>
+                <w:sz w:val="19"/>
+                <w:szCs w:val="19"/>
+              </w:rPr>
+              <w:t xml:space="preserve">Proposed model on the 1,788 held-out applicants</w:t>
+            </w:r>
+          </w:p>
+        </w:tc>
+        <w:tc>
+          <w:tcPr>
+            <w:tcW w:type="dxa" w:w="2000"/>
+            <w:tcBorders>
+              <w:top w:val="single" w:color="BFBFBF" w:sz="4"/>
+              <w:left w:val="single" w:color="BFBFBF" w:sz="4"/>
+              <w:bottom w:val="single" w:color="BFBFBF" w:sz="4"/>
+              <w:right w:val="single" w:color="BFBFBF" w:sz="4"/>
+            </w:tcBorders>
+            <w:shd w:fill="1E2761" w:color="auto" w:val="clear"/>
+            <w:tcMar>
+              <w:top w:type="dxa" w:w="60"/>
+              <w:left w:type="dxa" w:w="100"/>
+              <w:bottom w:type="dxa" w:w="60"/>
+              <w:right w:type="dxa" w:w="100"/>
+            </w:tcMar>
+          </w:tcPr>
+          <w:p>
+            <w:pPr>
+              <w:keepNext/>
+              <w:spacing w:after="0"/>
+              <w:jc w:val="left"/>
+            </w:pPr>
+            <w:r>
+              <w:rPr>
+                <w:rFonts w:ascii="Calibri" w:cs="Calibri" w:eastAsia="Calibri" w:hAnsi="Calibri"/>
+                <w:b/>
+                <w:bCs/>
+                <w:color w:val="FFFFFF"/>
+                <w:sz w:val="19"/>
+                <w:szCs w:val="19"/>
+              </w:rPr>
+              <w:t xml:space="preserve">Model flags as likely default</w:t>
+            </w:r>
+          </w:p>
+        </w:tc>
+        <w:tc>
+          <w:tcPr>
+            <w:tcW w:type="dxa" w:w="2300"/>
+            <w:tcBorders>
+              <w:top w:val="single" w:color="BFBFBF" w:sz="4"/>
+              <w:left w:val="single" w:color="BFBFBF" w:sz="4"/>
+              <w:bottom w:val="single" w:color="BFBFBF" w:sz="4"/>
+              <w:right w:val="single" w:color="BFBFBF" w:sz="4"/>
+            </w:tcBorders>
+            <w:shd w:fill="1E2761" w:color="auto" w:val="clear"/>
+            <w:tcMar>
+              <w:top w:type="dxa" w:w="60"/>
+              <w:left w:type="dxa" w:w="100"/>
+              <w:bottom w:type="dxa" w:w="60"/>
+              <w:right w:type="dxa" w:w="100"/>
+            </w:tcMar>
+          </w:tcPr>
+          <w:p>
+            <w:pPr>
+              <w:keepNext/>
+              <w:spacing w:after="0"/>
+              <w:jc w:val="left"/>
+            </w:pPr>
+            <w:r>
+              <w:rPr>
+                <w:rFonts w:ascii="Calibri" w:cs="Calibri" w:eastAsia="Calibri" w:hAnsi="Calibri"/>
+                <w:b/>
+                <w:bCs/>
+                <w:color w:val="FFFFFF"/>
+                <w:sz w:val="19"/>
+                <w:szCs w:val="19"/>
+              </w:rPr>
+              <w:t xml:space="preserve">Model clears as likely to repay</w:t>
+            </w:r>
+          </w:p>
+        </w:tc>
+        <w:tc>
+          <w:tcPr>
+            <w:tcW w:type="dxa" w:w="1600"/>
+            <w:tcBorders>
+              <w:top w:val="single" w:color="BFBFBF" w:sz="4"/>
+              <w:left w:val="single" w:color="BFBFBF" w:sz="4"/>
+              <w:bottom w:val="single" w:color="BFBFBF" w:sz="4"/>
+              <w:right w:val="single" w:color="BFBFBF" w:sz="4"/>
+            </w:tcBorders>
+            <w:shd w:fill="1E2761" w:color="auto" w:val="clear"/>
+            <w:tcMar>
+              <w:top w:type="dxa" w:w="60"/>
+              <w:left w:type="dxa" w:w="100"/>
+              <w:bottom w:type="dxa" w:w="60"/>
+              <w:right w:type="dxa" w:w="100"/>
+            </w:tcMar>
+          </w:tcPr>
+          <w:p>
+            <w:pPr>
+              <w:keepNext/>
+              <w:spacing w:after="0"/>
+              <w:jc w:val="left"/>
+            </w:pPr>
+            <w:r>
+              <w:rPr>
+                <w:rFonts w:ascii="Calibri" w:cs="Calibri" w:eastAsia="Calibri" w:hAnsi="Calibri"/>
+                <w:b/>
+                <w:bCs/>
+                <w:color w:val="FFFFFF"/>
+                <w:sz w:val="19"/>
+                <w:szCs w:val="19"/>
+              </w:rPr>
+              <w:t xml:space="preserve">Total</w:t>
+            </w:r>
+          </w:p>
+        </w:tc>
+      </w:tr>
+      <w:tr>
+        <w:trPr>
+          <w:cantSplit/>
+        </w:trPr>
+        <w:tc>
+          <w:tcPr>
+            <w:tcW w:type="dxa" w:w="3460"/>
+            <w:tcBorders>
+              <w:top w:val="single" w:color="BFBFBF" w:sz="4"/>
+              <w:left w:val="single" w:color="BFBFBF" w:sz="4"/>
+              <w:bottom w:val="single" w:color="BFBFBF" w:sz="4"/>
+              <w:right w:val="single" w:color="BFBFBF" w:sz="4"/>
+            </w:tcBorders>
+            <w:tcMar>
+              <w:top w:type="dxa" w:w="60"/>
+              <w:left w:type="dxa" w:w="100"/>
+              <w:bottom w:type="dxa" w:w="60"/>
+              <w:right w:type="dxa" w:w="100"/>
+            </w:tcMar>
+          </w:tcPr>
+          <w:p>
+            <w:pPr>
+              <w:keepNext/>
+              <w:spacing w:after="0"/>
+              <w:jc w:val="left"/>
+            </w:pPr>
+            <w:r>
+              <w:rPr>
+                <w:rFonts w:ascii="Calibri" w:cs="Calibri" w:eastAsia="Calibri" w:hAnsi="Calibri"/>
+                <w:b w:val="false"/>
+                <w:bCs w:val="false"/>
+                <w:color w:val="000000"/>
+                <w:sz w:val="19"/>
+                <w:szCs w:val="19"/>
+              </w:rPr>
+              <w:t xml:space="preserve">Actually defaulted</w:t>
+            </w:r>
+          </w:p>
+        </w:tc>
+        <w:tc>
+          <w:tcPr>
+            <w:tcW w:type="dxa" w:w="2000"/>
+            <w:tcBorders>
+              <w:top w:val="single" w:color="BFBFBF" w:sz="4"/>
+              <w:left w:val="single" w:color="BFBFBF" w:sz="4"/>
+              <w:bottom w:val="single" w:color="BFBFBF" w:sz="4"/>
+              <w:right w:val="single" w:color="BFBFBF" w:sz="4"/>
+            </w:tcBorders>
+            <w:tcMar>
+              <w:top w:type="dxa" w:w="60"/>
+              <w:left w:type="dxa" w:w="100"/>
+              <w:bottom w:type="dxa" w:w="60"/>
+              <w:right w:type="dxa" w:w="100"/>
+            </w:tcMar>
+          </w:tcPr>
+          <w:p>
+            <w:pPr>
+              <w:keepNext/>
+              <w:spacing w:after="0"/>
+              <w:jc w:val="left"/>
+            </w:pPr>
+            <w:r>
+              <w:rPr>
+                <w:rFonts w:ascii="Calibri" w:cs="Calibri" w:eastAsia="Calibri" w:hAnsi="Calibri"/>
+                <w:b w:val="false"/>
+                <w:bCs w:val="false"/>
+                <w:color w:val="000000"/>
+                <w:sz w:val="19"/>
+                <w:szCs w:val="19"/>
+              </w:rPr>
+              <w:t xml:space="preserve">333 (caught)</w:t>
+            </w:r>
+          </w:p>
+        </w:tc>
+        <w:tc>
+          <w:tcPr>
+            <w:tcW w:type="dxa" w:w="2300"/>
+            <w:tcBorders>
+              <w:top w:val="single" w:color="BFBFBF" w:sz="4"/>
+              <w:left w:val="single" w:color="BFBFBF" w:sz="4"/>
+              <w:bottom w:val="single" w:color="BFBFBF" w:sz="4"/>
+              <w:right w:val="single" w:color="BFBFBF" w:sz="4"/>
+            </w:tcBorders>
+            <w:tcMar>
+              <w:top w:type="dxa" w:w="60"/>
+              <w:left w:type="dxa" w:w="100"/>
+              <w:bottom w:type="dxa" w:w="60"/>
+              <w:right w:type="dxa" w:w="100"/>
+            </w:tcMar>
+          </w:tcPr>
+          <w:p>
+            <w:pPr>
+              <w:keepNext/>
+              <w:spacing w:after="0"/>
+              <w:jc w:val="left"/>
+            </w:pPr>
+            <w:r>
+              <w:rPr>
+                <w:rFonts w:ascii="Calibri" w:cs="Calibri" w:eastAsia="Calibri" w:hAnsi="Calibri"/>
+                <w:b w:val="false"/>
+                <w:bCs w:val="false"/>
+                <w:color w:val="000000"/>
+                <w:sz w:val="19"/>
+                <w:szCs w:val="19"/>
+              </w:rPr>
+              <w:t xml:space="preserve">24 (missed)</w:t>
+            </w:r>
+          </w:p>
+        </w:tc>
+        <w:tc>
+          <w:tcPr>
+            <w:tcW w:type="dxa" w:w="1600"/>
+            <w:tcBorders>
+              <w:top w:val="single" w:color="BFBFBF" w:sz="4"/>
+              <w:left w:val="single" w:color="BFBFBF" w:sz="4"/>
+              <w:bottom w:val="single" w:color="BFBFBF" w:sz="4"/>
+              <w:right w:val="single" w:color="BFBFBF" w:sz="4"/>
+            </w:tcBorders>
+            <w:tcMar>
+              <w:top w:type="dxa" w:w="60"/>
+              <w:left w:type="dxa" w:w="100"/>
+              <w:bottom w:type="dxa" w:w="60"/>
+              <w:right w:type="dxa" w:w="100"/>
+            </w:tcMar>
+          </w:tcPr>
+          <w:p>
+            <w:pPr>
+              <w:keepNext/>
+              <w:spacing w:after="0"/>
+              <w:jc w:val="right"/>
+            </w:pPr>
+            <w:r>
+              <w:rPr>
+                <w:rFonts w:ascii="Calibri" w:cs="Calibri" w:eastAsia="Calibri" w:hAnsi="Calibri"/>
+                <w:b w:val="false"/>
+                <w:bCs w:val="false"/>
+                <w:color w:val="000000"/>
+                <w:sz w:val="19"/>
+                <w:szCs w:val="19"/>
+              </w:rPr>
+              <w:t xml:space="preserve">357</w:t>
+            </w:r>
+          </w:p>
+        </w:tc>
+      </w:tr>
+      <w:tr>
+        <w:trPr>
+          <w:cantSplit/>
+        </w:trPr>
+        <w:tc>
+          <w:tcPr>
+            <w:tcW w:type="dxa" w:w="3460"/>
+            <w:tcBorders>
+              <w:top w:val="single" w:color="BFBFBF" w:sz="4"/>
+              <w:left w:val="single" w:color="BFBFBF" w:sz="4"/>
+              <w:bottom w:val="single" w:color="BFBFBF" w:sz="4"/>
+              <w:right w:val="single" w:color="BFBFBF" w:sz="4"/>
+            </w:tcBorders>
+            <w:tcMar>
+              <w:top w:type="dxa" w:w="60"/>
+              <w:left w:type="dxa" w:w="100"/>
+              <w:bottom w:type="dxa" w:w="60"/>
+              <w:right w:type="dxa" w:w="100"/>
+            </w:tcMar>
+          </w:tcPr>
+          <w:p>
+            <w:pPr>
+              <w:keepNext/>
+              <w:spacing w:after="0"/>
+              <w:jc w:val="left"/>
+            </w:pPr>
+            <w:r>
+              <w:rPr>
+                <w:rFonts w:ascii="Calibri" w:cs="Calibri" w:eastAsia="Calibri" w:hAnsi="Calibri"/>
+                <w:b w:val="false"/>
+                <w:bCs w:val="false"/>
+                <w:color w:val="000000"/>
+                <w:sz w:val="19"/>
+                <w:szCs w:val="19"/>
+              </w:rPr>
+              <w:t xml:space="preserve">Actually repaid</w:t>
+            </w:r>
+          </w:p>
+        </w:tc>
+        <w:tc>
+          <w:tcPr>
+            <w:tcW w:type="dxa" w:w="2000"/>
+            <w:tcBorders>
+              <w:top w:val="single" w:color="BFBFBF" w:sz="4"/>
+              <w:left w:val="single" w:color="BFBFBF" w:sz="4"/>
+              <w:bottom w:val="single" w:color="BFBFBF" w:sz="4"/>
+              <w:right w:val="single" w:color="BFBFBF" w:sz="4"/>
+            </w:tcBorders>
+            <w:tcMar>
+              <w:top w:type="dxa" w:w="60"/>
+              <w:left w:type="dxa" w:w="100"/>
+              <w:bottom w:type="dxa" w:w="60"/>
+              <w:right w:type="dxa" w:w="100"/>
+            </w:tcMar>
+          </w:tcPr>
+          <w:p>
+            <w:pPr>
+              <w:keepNext/>
+              <w:spacing w:after="0"/>
+              <w:jc w:val="left"/>
+            </w:pPr>
+            <w:r>
+              <w:rPr>
+                <w:rFonts w:ascii="Calibri" w:cs="Calibri" w:eastAsia="Calibri" w:hAnsi="Calibri"/>
+                <w:b w:val="false"/>
+                <w:bCs w:val="false"/>
+                <w:color w:val="000000"/>
+                <w:sz w:val="19"/>
+                <w:szCs w:val="19"/>
+              </w:rPr>
+              <w:t xml:space="preserve">164 (wrongly flagged)</w:t>
+            </w:r>
+          </w:p>
+        </w:tc>
+        <w:tc>
+          <w:tcPr>
+            <w:tcW w:type="dxa" w:w="2300"/>
+            <w:tcBorders>
+              <w:top w:val="single" w:color="BFBFBF" w:sz="4"/>
+              <w:left w:val="single" w:color="BFBFBF" w:sz="4"/>
+              <w:bottom w:val="single" w:color="BFBFBF" w:sz="4"/>
+              <w:right w:val="single" w:color="BFBFBF" w:sz="4"/>
+            </w:tcBorders>
+            <w:tcMar>
+              <w:top w:type="dxa" w:w="60"/>
+              <w:left w:type="dxa" w:w="100"/>
+              <w:bottom w:type="dxa" w:w="60"/>
+              <w:right w:type="dxa" w:w="100"/>
+            </w:tcMar>
+          </w:tcPr>
+          <w:p>
+            <w:pPr>
+              <w:keepNext/>
+              <w:spacing w:after="0"/>
+              <w:jc w:val="left"/>
+            </w:pPr>
+            <w:r>
+              <w:rPr>
+                <w:rFonts w:ascii="Calibri" w:cs="Calibri" w:eastAsia="Calibri" w:hAnsi="Calibri"/>
+                <w:b w:val="false"/>
+                <w:bCs w:val="false"/>
+                <w:color w:val="000000"/>
+                <w:sz w:val="19"/>
+                <w:szCs w:val="19"/>
+              </w:rPr>
+              <w:t xml:space="preserve">1,267 (correctly cleared)</w:t>
+            </w:r>
+          </w:p>
+        </w:tc>
+        <w:tc>
+          <w:tcPr>
+            <w:tcW w:type="dxa" w:w="1600"/>
+            <w:tcBorders>
+              <w:top w:val="single" w:color="BFBFBF" w:sz="4"/>
+              <w:left w:val="single" w:color="BFBFBF" w:sz="4"/>
+              <w:bottom w:val="single" w:color="BFBFBF" w:sz="4"/>
+              <w:right w:val="single" w:color="BFBFBF" w:sz="4"/>
+            </w:tcBorders>
+            <w:tcMar>
+              <w:top w:type="dxa" w:w="60"/>
+              <w:left w:type="dxa" w:w="100"/>
+              <w:bottom w:type="dxa" w:w="60"/>
+              <w:right w:type="dxa" w:w="100"/>
+            </w:tcMar>
+          </w:tcPr>
+          <w:p>
+            <w:pPr>
+              <w:keepNext/>
+              <w:spacing w:after="0"/>
+              <w:jc w:val="right"/>
+            </w:pPr>
+            <w:r>
+              <w:rPr>
+                <w:rFonts w:ascii="Calibri" w:cs="Calibri" w:eastAsia="Calibri" w:hAnsi="Calibri"/>
+                <w:b w:val="false"/>
+                <w:bCs w:val="false"/>
+                <w:color w:val="000000"/>
+                <w:sz w:val="19"/>
+                <w:szCs w:val="19"/>
+              </w:rPr>
+              <w:t xml:space="preserve">1,431</w:t>
+            </w:r>
+          </w:p>
+        </w:tc>
+      </w:tr>
+      <w:tr>
+        <w:trPr>
+          <w:cantSplit/>
+        </w:trPr>
+        <w:tc>
+          <w:tcPr>
+            <w:tcW w:type="dxa" w:w="3460"/>
+            <w:tcBorders>
+              <w:top w:val="single" w:color="BFBFBF" w:sz="4"/>
+              <w:left w:val="single" w:color="BFBFBF" w:sz="4"/>
+              <w:bottom w:val="single" w:color="BFBFBF" w:sz="4"/>
+              <w:right w:val="single" w:color="BFBFBF" w:sz="4"/>
+            </w:tcBorders>
+            <w:tcMar>
+              <w:top w:type="dxa" w:w="60"/>
+              <w:left w:type="dxa" w:w="100"/>
+              <w:bottom w:type="dxa" w:w="60"/>
+              <w:right w:type="dxa" w:w="100"/>
+            </w:tcMar>
+          </w:tcPr>
+          <w:p>
+            <w:pPr>
+              <w:keepNext w:val="false"/>
+              <w:spacing w:after="0"/>
+              <w:jc w:val="left"/>
+            </w:pPr>
+            <w:r>
+              <w:rPr>
+                <w:rFonts w:ascii="Calibri" w:cs="Calibri" w:eastAsia="Calibri" w:hAnsi="Calibri"/>
+                <w:b w:val="false"/>
+                <w:bCs w:val="false"/>
+                <w:color w:val="000000"/>
+                <w:sz w:val="19"/>
+                <w:szCs w:val="19"/>
+              </w:rPr>
+              <w:t xml:space="preserve">Total</w:t>
+            </w:r>
+          </w:p>
+        </w:tc>
+        <w:tc>
+          <w:tcPr>
+            <w:tcW w:type="dxa" w:w="2000"/>
+            <w:tcBorders>
+              <w:top w:val="single" w:color="BFBFBF" w:sz="4"/>
+              <w:left w:val="single" w:color="BFBFBF" w:sz="4"/>
+              <w:bottom w:val="single" w:color="BFBFBF" w:sz="4"/>
+              <w:right w:val="single" w:color="BFBFBF" w:sz="4"/>
+            </w:tcBorders>
+            <w:tcMar>
+              <w:top w:type="dxa" w:w="60"/>
+              <w:left w:type="dxa" w:w="100"/>
+              <w:bottom w:type="dxa" w:w="60"/>
+              <w:right w:type="dxa" w:w="100"/>
+            </w:tcMar>
+          </w:tcPr>
+          <w:p>
+            <w:pPr>
+              <w:keepNext w:val="false"/>
+              <w:spacing w:after="0"/>
+              <w:jc w:val="right"/>
+            </w:pPr>
+            <w:r>
+              <w:rPr>
+                <w:rFonts w:ascii="Calibri" w:cs="Calibri" w:eastAsia="Calibri" w:hAnsi="Calibri"/>
+                <w:b w:val="false"/>
+                <w:bCs w:val="false"/>
+                <w:color w:val="000000"/>
+                <w:sz w:val="19"/>
+                <w:szCs w:val="19"/>
+              </w:rPr>
+              <w:t xml:space="preserve">497</w:t>
+            </w:r>
+          </w:p>
+        </w:tc>
+        <w:tc>
+          <w:tcPr>
+            <w:tcW w:type="dxa" w:w="2300"/>
+            <w:tcBorders>
+              <w:top w:val="single" w:color="BFBFBF" w:sz="4"/>
+              <w:left w:val="single" w:color="BFBFBF" w:sz="4"/>
+              <w:bottom w:val="single" w:color="BFBFBF" w:sz="4"/>
+              <w:right w:val="single" w:color="BFBFBF" w:sz="4"/>
+            </w:tcBorders>
+            <w:tcMar>
+              <w:top w:type="dxa" w:w="60"/>
+              <w:left w:type="dxa" w:w="100"/>
+              <w:bottom w:type="dxa" w:w="60"/>
+              <w:right w:type="dxa" w:w="100"/>
+            </w:tcMar>
+          </w:tcPr>
+          <w:p>
+            <w:pPr>
+              <w:keepNext w:val="false"/>
+              <w:spacing w:after="0"/>
+              <w:jc w:val="right"/>
+            </w:pPr>
+            <w:r>
+              <w:rPr>
+                <w:rFonts w:ascii="Calibri" w:cs="Calibri" w:eastAsia="Calibri" w:hAnsi="Calibri"/>
+                <w:b w:val="false"/>
+                <w:bCs w:val="false"/>
+                <w:color w:val="000000"/>
+                <w:sz w:val="19"/>
+                <w:szCs w:val="19"/>
+              </w:rPr>
+              <w:t xml:space="preserve">1,291</w:t>
+            </w:r>
+          </w:p>
+        </w:tc>
+        <w:tc>
+          <w:tcPr>
+            <w:tcW w:type="dxa" w:w="1600"/>
+            <w:tcBorders>
+              <w:top w:val="single" w:color="BFBFBF" w:sz="4"/>
+              <w:left w:val="single" w:color="BFBFBF" w:sz="4"/>
+              <w:bottom w:val="single" w:color="BFBFBF" w:sz="4"/>
+              <w:right w:val="single" w:color="BFBFBF" w:sz="4"/>
+            </w:tcBorders>
+            <w:tcMar>
+              <w:top w:type="dxa" w:w="60"/>
+              <w:left w:type="dxa" w:w="100"/>
+              <w:bottom w:type="dxa" w:w="60"/>
+              <w:right w:type="dxa" w:w="100"/>
+            </w:tcMar>
+          </w:tcPr>
+          <w:p>
+            <w:pPr>
+              <w:keepNext w:val="false"/>
+              <w:spacing w:after="0"/>
+              <w:jc w:val="right"/>
+            </w:pPr>
+            <w:r>
+              <w:rPr>
+                <w:rFonts w:ascii="Calibri" w:cs="Calibri" w:eastAsia="Calibri" w:hAnsi="Calibri"/>
+                <w:b w:val="false"/>
+                <w:bCs w:val="false"/>
+                <w:color w:val="000000"/>
+                <w:sz w:val="19"/>
+                <w:szCs w:val="19"/>
+              </w:rPr>
+              <w:t xml:space="preserve">1,788</w:t>
+            </w:r>
+          </w:p>
+        </w:tc>
+      </w:tr>
+    </w:tbl>
     <w:p>
       <w:pPr>
         <w:spacing w:after="220"/>
@@ -6570,70 +7415,7 @@
           <w:sz w:val="19"/>
           <w:szCs w:val="19"/>
         </w:rPr>
-        <w:t xml:space="preserve">Figure A4. ROC curves on the test set. The Random Forest ranks applicants by risk most accurately.</w:t>
-      </w:r>
-    </w:p>
-    <w:p>
-      <w:pPr>
-        <w:spacing w:after="60" w:before="120"/>
-        <w:jc w:val="center"/>
-      </w:pPr>
-      <w:r>
-        <w:drawing>
-          <wp:inline distT="0" distB="0" distL="0" distR="0">
-            <wp:extent cx="3476625" cy="2562225"/>
-            <wp:effectExtent t="0" r="0" b="0" l="0"/>
-            <wp:docPr id="8" name=""/>
-            <wp:cNvGraphicFramePr>
-              <a:graphicFrameLocks xmlns:a="http://schemas.openxmlformats.org/drawingml/2006/main" noChangeAspect="1"/>
-            </wp:cNvGraphicFramePr>
-            <a:graphic xmlns:a="http://schemas.openxmlformats.org/drawingml/2006/main">
-              <a:graphicData uri="http://schemas.openxmlformats.org/drawingml/2006/picture">
-                <pic:pic xmlns:pic="http://schemas.openxmlformats.org/drawingml/2006/picture">
-                  <pic:nvPicPr>
-                    <pic:cNvPr id="0" name="" descr=""/>
-                    <pic:cNvPicPr>
-                      <a:picLocks noChangeAspect="1" noChangeArrowheads="1"/>
-                    </pic:cNvPicPr>
-                  </pic:nvPicPr>
-                  <pic:blipFill>
-                    <a:blip r:embed="rId15" cstate="none"/>
-                    <a:srcRect/>
-                    <a:stretch>
-                      <a:fillRect/>
-                    </a:stretch>
-                  </pic:blipFill>
-                  <pic:spPr bwMode="auto">
-                    <a:xfrm>
-                      <a:off x="0" y="0"/>
-                      <a:ext cx="3476625" cy="2562225"/>
-                    </a:xfrm>
-                    <a:prstGeom prst="rect">
-                      <a:avLst/>
-                    </a:prstGeom>
-                  </pic:spPr>
-                </pic:pic>
-              </a:graphicData>
-            </a:graphic>
-          </wp:inline>
-        </w:drawing>
-      </w:r>
-    </w:p>
-    <w:p>
-      <w:pPr>
-        <w:spacing w:after="220"/>
-        <w:jc w:val="center"/>
-      </w:pPr>
-      <w:r>
-        <w:rPr>
-          <w:rFonts w:ascii="Calibri" w:cs="Calibri" w:eastAsia="Calibri" w:hAnsi="Calibri"/>
-          <w:i/>
-          <w:iCs/>
-          <w:color w:val="595959"/>
-          <w:sz w:val="19"/>
-          <w:szCs w:val="19"/>
-        </w:rPr>
-        <w:t xml:space="preserve">Figure A5. Confusion matrix of the proposed model (class-weighted Random Forest, threshold 0.25) on the 1,788 test applicants: 333 of 357 defaulters caught, 164 good customers flagged.</w:t>
+        <w:t xml:space="preserve">Table A1. Decisions of the proposed model (class-weighted Random Forest, threshold 0.25) on the held-out applicants: 93.3% of defaulters caught; 67.0% of flagged applicants were real defaulters; 89.5% of all decisions correct.</w:t>
       </w:r>
     </w:p>
     <w:p>

</xml_diff>

<commit_message>
Resolve the last three verification notes (fair-lending mitigation, 3+ derogatory rate, surrogate rule wording)
Co-Authored-By: Claude Fable 5.1 <noreply@anthropic.com>
Claude-Session: https://claude.ai/code/session_013FziBHdvbXYQwd5XRG4tZw
</commit_message>
<xml_diff>
--- a/reports/Loan_Default_Prediction_Final_Report.docx
+++ b/reports/Loan_Default_Prediction_Final_Report.docx
@@ -616,7 +616,7 @@
                 <w:sz w:val="19"/>
                 <w:szCs w:val="19"/>
               </w:rPr>
-              <w:t xml:space="preserve">All 27 model inputs: the 10 financial attributes (LOAN, MORTDUE, VALUE, YOJ, DEROG, DELINQ, CLAGE, NINQ, CLNO, DEBTINC), a missing-value flag for each of the 11 fields with gaps, and the occupation and loan-purpose indicators. Fallback if the fair-lending review requires it: the same forest on 12 inputs without occupation and loan purpose (about a sixth more expected credit-error cost).</w:t>
+              <w:t xml:space="preserve">All 27 model inputs: the 10 financial attributes (LOAN, MORTDUE, VALUE, YOJ, DEROG, DELINQ, CLAGE, NINQ, CLNO, DEBTINC), a missing-value flag for each of the 11 fields with gaps, and the occupation and loan-purpose indicators. Fallback if the fair-lending review requires it: the same forest on 12 inputs, without occupation, loan purpose and nine of the eleven missing flags (about a sixth more expected credit-error cost).</w:t>
             </w:r>
           </w:p>
         </w:tc>
@@ -3657,7 +3657,7 @@
           <w:sz w:val="22"/>
           <w:szCs w:val="22"/>
         </w:rPr>
-        <w:t xml:space="preserve">A forest of 200 trees cannot be read as a rule list, so a four-level decision tree was fitted to the forest's own decisions (flag or clear at the 0.25 threshold) rather than to the original labels. It reproduces 90% of the forest's decisions on unseen applicants, and its rules are the same drivers the analysis found throughout: is the debt-to-income ratio missing; if recorded, is it above about 44%; how many delinquent credit lines; how long is the credit history; what is the loan size and job tenure. Those rules supply the adverse-action reasons; the forest's feature importances (Figure 3) and per-applicant top risk drivers document the score itself.</w:t>
+        <w:t xml:space="preserve">A forest of 200 trees cannot be read as a rule list, so a four-level decision tree was fitted to the forest's own decisions (flag or clear at the 0.25 threshold) rather than to the original labels. It reproduces 90% of the forest's decisions on unseen applicants, and its rules are the same drivers the analysis found throughout: is the debt-to-income ratio missing; if recorded, is it above about 44%; how many delinquent credit lines; how long is the credit history; how many years in the current job. Those rules supply the adverse-action reasons; the forest's feature importances (Figure 3) and per-applicant top risk drivers document the score itself.</w:t>
       </w:r>
     </w:p>
     <w:p>
@@ -6035,7 +6035,7 @@
                 <w:sz w:val="19"/>
                 <w:szCs w:val="19"/>
               </w:rPr>
-              <w:t xml:space="preserve">Exclude occupation from the production model; disparate-impact testing before launch and annually.</w:t>
+              <w:t xml:space="preserve">Disparate-impact testing before launch and annually; switch to the 12-input fallback (no occupation, loan purpose or minor flags) if the review requires it.</w:t>
             </w:r>
           </w:p>
         </w:tc>

</xml_diff>

<commit_message>
Rebuild notebooks, figures and reports with the two-panel threshold chart
Both notebooks were re-executed end to end with the new two-panel
threshold chart (no errors, model results unchanged). The report figure
was regenerated from the executed notebook, and both reports were
rebuilt and validated.

Co-Authored-By: Claude Opus 5.5 <noreply@anthropic.com>
Claude-Session: https://claude.ai/code/session_013FziBHdvbXYQwd5XRG4tZw
</commit_message>
<xml_diff>
--- a/reports/Loan_Default_Prediction_Final_Report.docx
+++ b/reports/Loan_Default_Prediction_Final_Report.docx
@@ -3581,7 +3581,7 @@
       <w:r>
         <w:drawing>
           <wp:inline distT="0" distB="0" distL="0" distR="0">
-            <wp:extent cx="5848350" cy="2476500"/>
+            <wp:extent cx="5848350" cy="3857625"/>
             <wp:effectExtent t="0" r="0" b="0" l="0"/>
             <wp:docPr id="2" name=""/>
             <wp:cNvGraphicFramePr>
@@ -3606,7 +3606,7 @@
                   <pic:spPr bwMode="auto">
                     <a:xfrm>
                       <a:off x="0" y="0"/>
-                      <a:ext cx="5848350" cy="2476500"/>
+                      <a:ext cx="5848350" cy="3857625"/>
                     </a:xfrm>
                     <a:prstGeom prst="rect">
                       <a:avLst/>
@@ -3633,7 +3633,7 @@
           <w:sz w:val="19"/>
           <w:szCs w:val="19"/>
         </w:rPr>
-        <w:t xml:space="preserve">Figure 2. Recall, precision and indicative expected cost per 1,000 applicants as the forest's decision threshold moves. We measured all three on out-of-fold predictions of the training rows. The test set played no part in the choice.</w:t>
+        <w:t xml:space="preserve">Figure 2. Recall, precision and indicative expected cost per 1,000 applicants as the forest's decision threshold moves. The top panel shows recall and precision, and the bottom panel shows the expected cost. We measured all three on out-of-fold predictions of the training rows. The test set played no part in the choice.</w:t>
       </w:r>
     </w:p>
     <w:p>

</xml_diff>

<commit_message>
Make input-set reduction explicit and rule-based across all deliverables
Apply the earlier project feedback on dimensionality reduction: name every
input at each pipeline stage, state the rule that picks the input set (the
smallest set within one standard error of the lowest out-of-fold cost) and
name the 21- and 12-input sets that the rule rejects.

- Notebooks: LR input printout, a model-inputs-by-stage table, and a
  final-pipeline step that applies the reduction rule to the named sets
- Milestone Report: new "Model inputs" treatment bullet and a rewritten
  "Simpler models cost more" paragraph
- Final Report, deck Appendix D and README: name the reduced sets and the rule

Co-Authored-By: Claude Opus 5.5 <noreply@anthropic.com>
Claude-Session: https://claude.ai/code/session_013FziBHdvbXYQwd5XRG4tZw
</commit_message>
<xml_diff>
--- a/reports/Loan_Default_Prediction_Final_Report.docx
+++ b/reports/Loan_Default_Prediction_Final_Report.docx
@@ -3586,7 +3586,7 @@
           <w:sz w:val="22"/>
           <w:szCs w:val="22"/>
         </w:rPr>
-        <w:t xml:space="preserve">Two settings decide how readily a forest flags an applicant: the extra weight given to defaulters during training (class weights) and the probability threshold. We chose them together, on the training rows alone, by one yardstick: the expected dollar cost of the model's mistakes. We estimated that cost on training applicants that the model did not see (three rounds of 5-fold cross-validation). We scored fifteen forest configurations and then five final forest candidates, each at its own cost-minimising threshold, under a rule that we fixed beforehand. The fifteen configurations were five weightings, each with fully grown trees or with trees limited to at least 5 or 10 applicants per leaf. Three candidates used the best configuration: on all 27 inputs, without occupation, and on a 12-input subset. The other two were the recall-tuned forest on 27 and 12 inputs. Under that rule, the lowest average cost wins. When several candidates are within the run-to-run noise of the estimate (about $10,500 per 1,000 applicants), the simplest wins.</w:t>
+        <w:t xml:space="preserve">Two settings decide how readily a forest flags an applicant: the extra weight given to defaulters during training (class weights) and the probability threshold. We chose them together, on the training rows alone, by one yardstick: the expected dollar cost of the model's mistakes. We estimated that cost on training applicants that the model did not see (three rounds of 5-fold cross-validation). We scored fifteen forest configurations and then five final forest candidates, each at its own cost-minimising threshold, under a rule that we fixed beforehand. The fifteen configurations were five weightings, each with fully grown trees or with trees limited to at least 5 or 10 applicants per leaf. Three candidates used the best configuration: all 27 inputs, 21 inputs without occupation, and 12 inputs. The 12-input set keeps only the 10 financial attributes and the DEBTINC and VALUE missing flags. The other two were the recall-tuned forest on 27 and 12 inputs. Under that rule, the lowest average cost wins. When several candidates are within the run-to-run noise of the estimate (about $10,500 per 1,000 applicants), the simplest wins (fewest non-default settings, then fewest inputs).</w:t>
       </w:r>
     </w:p>
     <w:p>
@@ -3600,7 +3600,7 @@
           <w:sz w:val="22"/>
           <w:szCs w:val="22"/>
         </w:rPr>
-        <w:t xml:space="preserve">Fully grown trees beat limited trees for every weighting. Among them, the unweighted, 0.3/0.7 and 0.2/0.8 forests were within that noise of each other, at thresholds of 0.15, 0.20 and 0.25. The balanced and 0.1/0.9 weightings cost about $13,000 and $27,000 more per 1,000 applicants. So we chose the unweighted forest on all 27 inputs. When precision also carries a cost, the recall-tuned grid winner cost about half again as much. The forest without occupation cost about 10% more. The 12-input forest cost about a fifth more. We scored the bagged trees, the balanced logistic regression and the recall-tuned decision tree the same way, at their own best thresholds. They cost about $390,000, $550,000 and $607,000 per 1,000 applicants, against $317,000 for the forest. So the forest wins on the chosen yardstick as well as on ranking quality.</w:t>
+        <w:t xml:space="preserve">Fully grown trees beat limited trees for every weighting. Among them, the unweighted, 0.3/0.7 and 0.2/0.8 forests were within that noise of each other, at thresholds of 0.15, 0.20 and 0.25. The balanced and 0.1/0.9 weightings cost about $13,000 and $27,000 more per 1,000 applicants. So we chose the unweighted forest on all 27 inputs. When precision also carries a cost, the recall-tuned grid winner cost about half again as much. The forest without occupation cost about 10% more. The 12-input forest cost about a fifth more. Neither smaller input set was within the noise, so the final model keeps all 27 inputs. We scored the bagged trees, the balanced logistic regression and the recall-tuned decision tree the same way, at their own best thresholds. They cost about $390,000, $550,000 and $607,000 per 1,000 applicants, against $317,000 for the forest. So the forest wins on the chosen yardstick as well as on ranking quality.</w:t>
       </w:r>
     </w:p>
     <w:p>

</xml_diff>

<commit_message>
Fix consistency findings after the switch to 22 inputs
- Call the $1.8m-to-$0.3m figure the cost of credit errors everywhere, not
  the default-related cost (Final Report, deck slide 2 and notes, low-code
  notebook)
- State that the other-splits check chose 0.15 for the unweighted 27-input
  forest, and no longer imply it covered the 22-input model
- "Every fully grown forest in Stage 1 and Stage 3" (the 10-input forest
  in the Stage 2 curve costs more than bagging)
- Low-code recall range 71% to 94%, 84 good applicants declined at 0.20,
  "12-input set" everywhere, shorter Stage 2 sentences, model-inputs table
  uses "step" so it does not clash with the selection stages, and the
  EDA-drivers table notes the surrogate's JOB_missing split

Co-Authored-By: Claude Opus 5.5 <noreply@anthropic.com>
Claude-Session: https://claude.ai/code/session_013FziBHdvbXYQwd5XRG4tZw
</commit_message>
<xml_diff>
--- a/reports/Loan_Default_Prediction_Final_Report.docx
+++ b/reports/Loan_Default_Prediction_Final_Report.docx
@@ -1259,7 +1259,7 @@
           <w:sz w:val="22"/>
           <w:szCs w:val="22"/>
         </w:rPr>
-        <w:t xml:space="preserve">Per 1,000 applicants, we expect the proposed model to catch about 185 of the 200 defaulters and to miss about 15. At the 0.15 threshold we expect it to flag about 90 creditworthy applicants. Under the approve / refer / decline bands, the bank declines about 64 creditworthy applicants per 1,000 automatically and refers about 58 to an underwriter. The cost assumptions are indicative: a missed defaulter costs about $9,000, and a wrongly declined good applicant costs about $2,000. Under these assumptions the model cuts default-related cost from roughly </w:t>
+        <w:t xml:space="preserve">Per 1,000 applicants, we expect the proposed model to catch about 185 of the 200 defaulters and to miss about 15. At the 0.15 threshold we expect it to flag about 90 creditworthy applicants. Under the approve / refer / decline bands, the bank declines about 64 creditworthy applicants per 1,000 automatically and refers about 58 to an underwriter. The cost assumptions are indicative: a missed defaulter costs about $9,000, and a wrongly declined good applicant costs about $2,000. Under these assumptions the model cuts the cost of credit errors from roughly </w:t>
       </w:r>
       <w:r>
         <w:rPr>
@@ -1295,7 +1295,7 @@
           <w:sz w:val="22"/>
           <w:szCs w:val="22"/>
         </w:rPr>
-        <w:t xml:space="preserve">, a reduction of about 83%.</w:t>
+        <w:t xml:space="preserve">. That is a reduction of about 83%.</w:t>
       </w:r>
     </w:p>
     <w:p>
@@ -3693,7 +3693,7 @@
           <w:sz w:val="22"/>
           <w:szCs w:val="22"/>
         </w:rPr>
-        <w:t xml:space="preserve">Stage 3 compared five forest candidates at their own best thresholds. Three were the chosen forest on the 22 selected inputs, on all 27 inputs and on 16 inputs without occupation. The other two were the recall-tuned forest on 27 and 12 inputs. The 12-input set keeps only the 10 financial attributes and the DEBTINC and VALUE missing flags. The forest on all 27 inputs had the lowest cost, about $317,000 per 1,000 applicants. The 22-input forest cost about $324,000, within one standard error, so the rule chose it as the simpler model. Averaged over three seeds, the two input sets differ by only about $1,100. Stage 3 therefore checked the 22-input forest against all 27 inputs and kept it. The forest without occupation cost about 13% more. When precision also carries a cost, the recall-tuned grid winner cost about half again as much. We scored the bagged trees, the balanced logistic regression and the recall-tuned decision tree the same way, at their own best thresholds. They cost about $390,000, $550,000 and $607,000 per 1,000 applicants, against $324,000 for the selected forest. So the forest wins on the chosen yardstick as well as on ranking quality.</w:t>
+        <w:t xml:space="preserve">Stage 3 compared five forest candidates at their own best thresholds. Three were the chosen forest on the 22 selected inputs, on all 27 inputs and on 16 inputs without occupation. The other two were the recall-tuned forest on 27 and 12 inputs. The 12-input set keeps only the 10 financial attributes and the DEBTINC and VALUE missing flags. The forest on all 27 inputs had the lowest cost, about $317,000 per 1,000 applicants. The 22-input forest cost about $324,000, within one standard error, so the rule chose it as the simpler model. Averaged over three seeds, the two input sets differ by only about $1,100. Stage 3 therefore kept the simpler 22-input forest. The forest without occupation cost about 13% more. When precision also carries a cost, the recall-tuned grid winner cost about half again as much. We scored the bagged trees, the balanced logistic regression and the recall-tuned decision tree the same way, at their own best thresholds. They cost about $390,000, $550,000 and $607,000 per 1,000 applicants, against $324,000 for the selected forest. So the forest wins on the chosen yardstick as well as on ranking quality.</w:t>
       </w:r>
     </w:p>
     <w:p>
@@ -4952,7 +4952,7 @@
           <w:sz w:val="22"/>
           <w:szCs w:val="22"/>
         </w:rPr>
-        <w:t xml:space="preserve">If the true ratio were nearer 2:1 or 3:1, the cost-minimising threshold would move to 0.20. At 0.20, the out-of-fold data shows about 90% recall and 85 good applicants declined per 1,000.</w:t>
+        <w:t xml:space="preserve">If the true ratio were nearer 2:1 or 3:1, the cost-minimising threshold would move to 0.20. At 0.20, the out-of-fold data shows about 90% recall and 84 good applicants declined per 1,000.</w:t>
       </w:r>
     </w:p>
     <w:p>

</xml_diff>